<commit_message>
Release: New Master Template adoption (Enquiry Proposal 3-page format) + Dynamic Extraction Pipeline
</commit_message>
<xml_diff>
--- a/output.docx
+++ b/output.docx
@@ -2,77 +2,343 @@
 <file path=word/document.xml><?xml version="1.0" encoding="utf-8"?>
 <w:document xmlns:wpc="http://schemas.microsoft.com/office/word/2010/wordprocessingCanvas" xmlns:mo="http://schemas.microsoft.com/office/mac/office/2008/main" xmlns:mc="http://schemas.openxmlformats.org/markup-compatibility/2006" xmlns:mv="urn:schemas-microsoft-com:mac:vml" xmlns:o="urn:schemas-microsoft-com:office:office" xmlns:r="http://schemas.openxmlformats.org/officeDocument/2006/relationships" xmlns:m="http://schemas.openxmlformats.org/officeDocument/2006/math" xmlns:v="urn:schemas-microsoft-com:vml" xmlns:wp14="http://schemas.microsoft.com/office/word/2010/wordprocessingDrawing" xmlns:wp="http://schemas.openxmlformats.org/drawingml/2006/wordprocessingDrawing" xmlns:w10="urn:schemas-microsoft-com:office:word" xmlns:w="http://schemas.openxmlformats.org/wordprocessingml/2006/main" xmlns:w14="http://schemas.microsoft.com/office/word/2010/wordml" xmlns:wpg="http://schemas.microsoft.com/office/word/2010/wordprocessingGroup" xmlns:wpi="http://schemas.microsoft.com/office/word/2010/wordprocessingInk" xmlns:wne="http://schemas.microsoft.com/office/word/2006/wordml" xmlns:wps="http://schemas.microsoft.com/office/word/2010/wordprocessingShape" mc:Ignorable="w14 wp14">
   <w:body>
+    <w:tbl>
+      <w:tblPr>
+        <w:tblW w:type="auto" w:w="0"/>
+        <w:jc w:val="center"/>
+        <w:tblLayout w:type="fixed"/>
+        <w:tblLook w:firstColumn="1" w:firstRow="1" w:lastColumn="0" w:lastRow="0" w:noHBand="0" w:noVBand="1" w:val="04A0"/>
+      </w:tblPr>
+      <w:tblGrid>
+        <w:gridCol w:w="5018"/>
+        <w:gridCol w:w="5018"/>
+      </w:tblGrid>
+      <w:tr>
+        <w:tc>
+          <w:tcPr>
+            <w:tcW w:type="dxa" w:w="6048"/>
+            <w:tcMar>
+              <w:top w:w="0" w:type="dxa"/>
+              <w:bottom w:w="40" w:type="dxa"/>
+              <w:left w:w="0" w:type="dxa"/>
+              <w:right w:w="40" w:type="dxa"/>
+            </w:tcMar>
+          </w:tcPr>
+          <w:p>
+            <w:pPr>
+              <w:spacing w:after="40"/>
+            </w:pPr>
+            <w:r>
+              <w:drawing>
+                <wp:inline xmlns:a="http://schemas.openxmlformats.org/drawingml/2006/main" xmlns:pic="http://schemas.openxmlformats.org/drawingml/2006/picture">
+                  <wp:extent cx="548640" cy="541020"/>
+                  <wp:docPr id="1" name="Picture 1"/>
+                  <wp:cNvGraphicFramePr>
+                    <a:graphicFrameLocks noChangeAspect="1"/>
+                  </wp:cNvGraphicFramePr>
+                  <a:graphic>
+                    <a:graphicData uri="http://schemas.openxmlformats.org/drawingml/2006/picture">
+                      <pic:pic>
+                        <pic:nvPicPr>
+                          <pic:cNvPr id="0" name="sail_logo.png"/>
+                          <pic:cNvPicPr/>
+                        </pic:nvPicPr>
+                        <pic:blipFill>
+                          <a:blip r:embed="rId9"/>
+                          <a:stretch>
+                            <a:fillRect/>
+                          </a:stretch>
+                        </pic:blipFill>
+                        <pic:spPr>
+                          <a:xfrm>
+                            <a:off x="0" y="0"/>
+                            <a:ext cx="548640" cy="541020"/>
+                          </a:xfrm>
+                          <a:prstGeom prst="rect"/>
+                        </pic:spPr>
+                      </pic:pic>
+                    </a:graphicData>
+                  </a:graphic>
+                </wp:inline>
+              </w:drawing>
+            </w:r>
+            <w:r>
+              <w:t xml:space="preserve">   </w:t>
+            </w:r>
+            <w:r>
+              <w:rPr>
+                <w:b/>
+                <w:sz w:val="19"/>
+              </w:rPr>
+              <w:t>Initiator :</w:t>
+              <w:br/>
+            </w:r>
+            <w:r>
+              <w:rPr>
+                <w:b/>
+                <w:sz w:val="19"/>
+              </w:rPr>
+              <w:t>SARAVANAN S</w:t>
+              <w:br/>
+            </w:r>
+            <w:r>
+              <w:rPr>
+                <w:sz w:val="18"/>
+              </w:rPr>
+              <w:t>PNo: L001558 ,SM(MM-PUR)</w:t>
+            </w:r>
+          </w:p>
+        </w:tc>
+        <w:tc>
+          <w:tcPr>
+            <w:tcW w:type="dxa" w:w="3989"/>
+            <w:tcMar>
+              <w:top w:w="0" w:type="dxa"/>
+              <w:bottom w:w="40" w:type="dxa"/>
+              <w:left w:w="40" w:type="dxa"/>
+              <w:right w:w="0" w:type="dxa"/>
+            </w:tcMar>
+          </w:tcPr>
+          <w:p>
+            <w:pPr>
+              <w:spacing w:after="40"/>
+              <w:jc w:val="right"/>
+            </w:pPr>
+            <w:r>
+              <w:rPr>
+                <w:b/>
+                <w:sz w:val="19"/>
+              </w:rPr>
+              <w:t>Department:</w:t>
+              <w:br/>
+            </w:r>
+            <w:r>
+              <w:rPr>
+                <w:b/>
+                <w:sz w:val="18"/>
+              </w:rPr>
+              <w:t>HQ/MM PURCHASE/MM PURCHASE</w:t>
+            </w:r>
+          </w:p>
+        </w:tc>
+      </w:tr>
+    </w:tbl>
+    <w:tbl>
+      <w:tblPr>
+        <w:tblW w:type="auto" w:w="0"/>
+        <w:jc w:val="center"/>
+        <w:tblLayout w:type="fixed"/>
+        <w:tblLook w:firstColumn="1" w:firstRow="1" w:lastColumn="0" w:lastRow="0" w:noHBand="0" w:noVBand="1" w:val="04A0"/>
+        <w:tblBorders>
+          <w:top w:val="single" w:sz="4" w:space="0" w:color="000000"/>
+          <w:left w:val="single" w:sz="4" w:space="0" w:color="000000"/>
+          <w:bottom w:val="single" w:sz="4" w:space="0" w:color="000000"/>
+          <w:right w:val="single" w:sz="4" w:space="0" w:color="000000"/>
+          <w:insideH w:val="single" w:sz="4" w:space="0" w:color="000000"/>
+          <w:insideV w:val="single" w:sz="4" w:space="0" w:color="000000"/>
+        </w:tblBorders>
+      </w:tblPr>
+      <w:tblGrid>
+        <w:gridCol w:w="5018"/>
+        <w:gridCol w:w="5018"/>
+      </w:tblGrid>
+      <w:tr>
+        <w:tc>
+          <w:tcPr>
+            <w:tcW w:type="dxa" w:w="6480"/>
+            <w:tcMar>
+              <w:top w:w="40" w:type="dxa"/>
+              <w:bottom w:w="40" w:type="dxa"/>
+              <w:left w:w="80" w:type="dxa"/>
+              <w:right w:w="80" w:type="dxa"/>
+            </w:tcMar>
+          </w:tcPr>
+          <w:p>
+            <w:pPr>
+              <w:spacing w:after="0"/>
+            </w:pPr>
+            <w:r>
+              <w:rPr>
+                <w:b/>
+                <w:sz w:val="18"/>
+              </w:rPr>
+              <w:t>Ref: SSP/SLM/MM PURCHASE/GEN/2025/214</w:t>
+            </w:r>
+          </w:p>
+        </w:tc>
+        <w:tc>
+          <w:tcPr>
+            <w:tcW w:type="dxa" w:w="3557"/>
+            <w:tcMar>
+              <w:top w:w="40" w:type="dxa"/>
+              <w:bottom w:w="40" w:type="dxa"/>
+              <w:left w:w="80" w:type="dxa"/>
+              <w:right w:w="80" w:type="dxa"/>
+            </w:tcMar>
+          </w:tcPr>
+          <w:p>
+            <w:pPr>
+              <w:spacing w:after="0"/>
+              <w:jc w:val="right"/>
+            </w:pPr>
+            <w:r>
+              <w:rPr>
+                <w:b/>
+                <w:sz w:val="18"/>
+              </w:rPr>
+              <w:t>Date: 05-05-2025</w:t>
+            </w:r>
+          </w:p>
+        </w:tc>
+      </w:tr>
+    </w:tbl>
     <w:p>
       <w:pPr>
-        <w:spacing w:after="40"/>
+        <w:spacing w:after="20"/>
+      </w:pPr>
+    </w:p>
+    <w:tbl>
+      <w:tblPr>
+        <w:tblW w:type="auto" w:w="0"/>
         <w:jc w:val="center"/>
+        <w:tblLayout w:type="fixed"/>
+        <w:tblLook w:firstColumn="1" w:firstRow="1" w:lastColumn="0" w:lastRow="0" w:noHBand="0" w:noVBand="1" w:val="04A0"/>
+        <w:tblBorders>
+          <w:top w:val="single" w:sz="4" w:space="0" w:color="000000"/>
+          <w:left w:val="single" w:sz="4" w:space="0" w:color="000000"/>
+          <w:bottom w:val="single" w:sz="4" w:space="0" w:color="000000"/>
+          <w:right w:val="single" w:sz="4" w:space="0" w:color="000000"/>
+          <w:insideH w:val="single" w:sz="4" w:space="0" w:color="000000"/>
+          <w:insideV w:val="single" w:sz="4" w:space="0" w:color="000000"/>
+        </w:tblBorders>
+      </w:tblPr>
+      <w:tblGrid>
+        <w:gridCol w:w="5018"/>
+        <w:gridCol w:w="5018"/>
+      </w:tblGrid>
+      <w:tr>
+        <w:tc>
+          <w:tcPr>
+            <w:tcW w:type="dxa" w:w="1584"/>
+            <w:tcMar>
+              <w:top w:w="50" w:type="dxa"/>
+              <w:bottom w:w="50" w:type="dxa"/>
+              <w:left w:w="80" w:type="dxa"/>
+              <w:right w:w="40" w:type="dxa"/>
+            </w:tcMar>
+          </w:tcPr>
+          <w:p>
+            <w:pPr>
+              <w:spacing w:after="0"/>
+            </w:pPr>
+            <w:r>
+              <w:rPr>
+                <w:b/>
+                <w:sz w:val="18"/>
+              </w:rPr>
+              <w:t>Subject:</w:t>
+              <w:br/>
+              <w:t>:</w:t>
+            </w:r>
+          </w:p>
+        </w:tc>
+        <w:tc>
+          <w:tcPr>
+            <w:tcW w:type="dxa" w:w="8453"/>
+            <w:tcMar>
+              <w:top w:w="50" w:type="dxa"/>
+              <w:bottom w:w="50" w:type="dxa"/>
+              <w:left w:w="40" w:type="dxa"/>
+              <w:right w:w="80" w:type="dxa"/>
+            </w:tcMar>
+          </w:tcPr>
+          <w:p>
+            <w:pPr>
+              <w:spacing w:after="0"/>
+            </w:pPr>
+            <w:r>
+              <w:rPr>
+                <w:sz w:val="18"/>
+              </w:rPr>
+              <w:t>Enquiry proposal for procurement of "MS Scrap Shredded" through EPS (Ref no. A612002)</w:t>
+            </w:r>
+          </w:p>
+        </w:tc>
+      </w:tr>
+    </w:tbl>
+    <w:p>
+      <w:pPr>
+        <w:spacing w:before="160" w:after="80"/>
       </w:pPr>
       <w:r>
         <w:rPr>
           <w:b/>
-          <w:color w:val="0F172A"/>
-          <w:sz w:val="30"/>
+          <w:sz w:val="21"/>
         </w:rPr>
-        <w:t>PURCHASE PROPOSAL NOTE</w:t>
-      </w:r>
-    </w:p>
-    <w:p>
-      <w:pPr>
-        <w:spacing w:after="200"/>
-        <w:jc w:val="center"/>
-      </w:pPr>
-      <w:r>
-        <w:rPr>
-          <w:b/>
-          <w:color w:val="475569"/>
-          <w:sz w:val="22"/>
-        </w:rPr>
-        <w:t>STEEL AUTHORITY OF INDIA LIMITED - SALEM STEEL PLANT</w:t>
+        <w:t>Background of the Proposal</w:t>
       </w:r>
     </w:p>
     <w:tbl>
       <w:tblPr>
         <w:tblW w:type="auto" w:w="0"/>
         <w:jc w:val="center"/>
+        <w:tblLayout w:type="fixed"/>
         <w:tblLook w:firstColumn="1" w:firstRow="1" w:lastColumn="0" w:lastRow="0" w:noHBand="0" w:noVBand="1" w:val="04A0"/>
         <w:tblBorders>
-          <w:top w:val="single" w:sz="4" w:space="0" w:color="CCCCCC"/>
-          <w:left w:val="single" w:sz="4" w:space="0" w:color="CCCCCC"/>
-          <w:bottom w:val="single" w:sz="4" w:space="0" w:color="CCCCCC"/>
-          <w:right w:val="single" w:sz="4" w:space="0" w:color="CCCCCC"/>
-          <w:insideH w:val="single" w:sz="4" w:space="0" w:color="CCCCCC"/>
-          <w:insideV w:val="single" w:sz="4" w:space="0" w:color="CCCCCC"/>
+          <w:top w:val="single" w:sz="4" w:space="0" w:color="000000"/>
+          <w:left w:val="single" w:sz="4" w:space="0" w:color="000000"/>
+          <w:bottom w:val="single" w:sz="4" w:space="0" w:color="000000"/>
+          <w:right w:val="single" w:sz="4" w:space="0" w:color="000000"/>
+          <w:insideH w:val="single" w:sz="4" w:space="0" w:color="000000"/>
+          <w:insideV w:val="single" w:sz="4" w:space="0" w:color="000000"/>
         </w:tblBorders>
       </w:tblPr>
       <w:tblGrid>
-        <w:gridCol w:w="5256"/>
-        <w:gridCol w:w="5256"/>
+        <w:gridCol w:w="5018"/>
+        <w:gridCol w:w="5018"/>
       </w:tblGrid>
       <w:tr>
         <w:tc>
           <w:tcPr>
-            <w:tcW w:type="dxa" w:w="6624"/>
-            <w:gridSpan w:val="2"/>
-            <w:shd w:fill="F1F5F9"/>
+            <w:tcW w:type="dxa" w:w="4176"/>
             <w:tcMar>
-              <w:top w:w="120" w:type="dxa"/>
-              <w:bottom w:w="120" w:type="dxa"/>
-              <w:left w:w="180" w:type="dxa"/>
-              <w:right w:w="180" w:type="dxa"/>
+              <w:top w:w="35" w:type="dxa"/>
+              <w:bottom w:w="35" w:type="dxa"/>
+              <w:left w:w="60" w:type="dxa"/>
+              <w:right w:w="60" w:type="dxa"/>
             </w:tcMar>
           </w:tcPr>
           <w:p>
             <w:pPr>
-              <w:spacing w:before="80" w:after="80"/>
+              <w:spacing w:after="0"/>
             </w:pPr>
             <w:r>
               <w:rPr>
-                <w:b/>
+                <w:sz w:val="18"/>
               </w:rPr>
-              <w:t xml:space="preserve">Description of the item: </w:t>
+              <w:t>i)   Indenter</w:t>
             </w:r>
+          </w:p>
+        </w:tc>
+        <w:tc>
+          <w:tcPr>
+            <w:tcW w:type="dxa" w:w="5861"/>
+            <w:tcMar>
+              <w:top w:w="35" w:type="dxa"/>
+              <w:bottom w:w="35" w:type="dxa"/>
+              <w:left w:w="60" w:type="dxa"/>
+              <w:right w:w="60" w:type="dxa"/>
+            </w:tcMar>
+          </w:tcPr>
+          <w:p>
+            <w:pPr>
+              <w:spacing w:after="0"/>
+            </w:pPr>
             <w:r>
-              <w:t>MS SCRAP - SHREDDED (Code: 135010000304)</w:t>
+              <w:rPr>
+                <w:sz w:val="18"/>
+              </w:rPr>
+              <w:t>GM (SMS-O) MNT</w:t>
             </w:r>
           </w:p>
         </w:tc>
@@ -80,25 +346,45 @@
       <w:tr>
         <w:tc>
           <w:tcPr>
-            <w:tcW w:type="dxa" w:w="6624"/>
-            <w:gridSpan w:val="2"/>
-            <w:shd w:fill="E2E8F0"/>
+            <w:tcW w:type="dxa" w:w="4176"/>
             <w:tcMar>
-              <w:top w:w="120" w:type="dxa"/>
-              <w:bottom w:w="120" w:type="dxa"/>
-              <w:left w:w="180" w:type="dxa"/>
-              <w:right w:w="180" w:type="dxa"/>
+              <w:top w:w="35" w:type="dxa"/>
+              <w:bottom w:w="35" w:type="dxa"/>
+              <w:left w:w="60" w:type="dxa"/>
+              <w:right w:w="60" w:type="dxa"/>
             </w:tcMar>
           </w:tcPr>
           <w:p>
             <w:pPr>
-              <w:spacing w:before="60" w:after="60"/>
+              <w:spacing w:after="0"/>
             </w:pPr>
             <w:r>
               <w:rPr>
-                <w:b/>
+                <w:sz w:val="18"/>
               </w:rPr>
-              <w:t>Indent Particulars</w:t>
+              <w:t>ii)  Indent ref  no &amp; date</w:t>
+            </w:r>
+          </w:p>
+        </w:tc>
+        <w:tc>
+          <w:tcPr>
+            <w:tcW w:type="dxa" w:w="5861"/>
+            <w:tcMar>
+              <w:top w:w="35" w:type="dxa"/>
+              <w:bottom w:w="35" w:type="dxa"/>
+              <w:left w:w="60" w:type="dxa"/>
+              <w:right w:w="60" w:type="dxa"/>
+            </w:tcMar>
+          </w:tcPr>
+          <w:p>
+            <w:pPr>
+              <w:spacing w:after="0"/>
+            </w:pPr>
+            <w:r>
+              <w:rPr>
+                <w:sz w:val="18"/>
+              </w:rPr>
+              <w:t>SMS/25/002 Dated:11/04/2025</w:t>
             </w:r>
           </w:p>
         </w:tc>
@@ -106,47 +392,45 @@
       <w:tr>
         <w:tc>
           <w:tcPr>
-            <w:tcW w:type="dxa" w:w="3744"/>
+            <w:tcW w:type="dxa" w:w="4176"/>
             <w:tcMar>
-              <w:top w:w="120" w:type="dxa"/>
-              <w:bottom w:w="120" w:type="dxa"/>
-              <w:left w:w="180" w:type="dxa"/>
-              <w:right w:w="180" w:type="dxa"/>
+              <w:top w:w="35" w:type="dxa"/>
+              <w:bottom w:w="35" w:type="dxa"/>
+              <w:left w:w="60" w:type="dxa"/>
+              <w:right w:w="60" w:type="dxa"/>
             </w:tcMar>
-            <w:shd w:fill="EDF2F7"/>
           </w:tcPr>
           <w:p>
             <w:pPr>
-              <w:spacing w:before="40" w:after="40"/>
+              <w:spacing w:after="0"/>
             </w:pPr>
             <w:r>
               <w:rPr>
-                <w:b/>
+                <w:sz w:val="18"/>
               </w:rPr>
-              <w:t>Parameter</w:t>
+              <w:t>iii) Description of the item</w:t>
             </w:r>
           </w:p>
         </w:tc>
         <w:tc>
           <w:tcPr>
-            <w:tcW w:type="dxa" w:w="6624"/>
+            <w:tcW w:type="dxa" w:w="5861"/>
             <w:tcMar>
-              <w:top w:w="120" w:type="dxa"/>
-              <w:bottom w:w="120" w:type="dxa"/>
-              <w:left w:w="180" w:type="dxa"/>
-              <w:right w:w="180" w:type="dxa"/>
+              <w:top w:w="35" w:type="dxa"/>
+              <w:bottom w:w="35" w:type="dxa"/>
+              <w:left w:w="60" w:type="dxa"/>
+              <w:right w:w="60" w:type="dxa"/>
             </w:tcMar>
-            <w:shd w:fill="EDF2F7"/>
           </w:tcPr>
           <w:p>
             <w:pPr>
-              <w:spacing w:before="40" w:after="40"/>
+              <w:spacing w:after="0"/>
             </w:pPr>
             <w:r>
               <w:rPr>
-                <w:b/>
+                <w:sz w:val="18"/>
               </w:rPr>
-              <w:t>Value</w:t>
+              <w:t>Supply of MS Scrap Shredded</w:t>
             </w:r>
           </w:p>
         </w:tc>
@@ -154,42 +438,45 @@
       <w:tr>
         <w:tc>
           <w:tcPr>
-            <w:tcW w:type="dxa" w:w="3744"/>
+            <w:tcW w:type="dxa" w:w="4176"/>
             <w:tcMar>
-              <w:top w:w="120" w:type="dxa"/>
-              <w:bottom w:w="120" w:type="dxa"/>
-              <w:left w:w="180" w:type="dxa"/>
-              <w:right w:w="180" w:type="dxa"/>
+              <w:top w:w="35" w:type="dxa"/>
+              <w:bottom w:w="35" w:type="dxa"/>
+              <w:left w:w="60" w:type="dxa"/>
+              <w:right w:w="60" w:type="dxa"/>
             </w:tcMar>
           </w:tcPr>
           <w:p>
             <w:pPr>
-              <w:spacing w:before="40" w:after="40"/>
+              <w:spacing w:after="0"/>
             </w:pPr>
             <w:r>
               <w:rPr>
-                <w:b/>
+                <w:sz w:val="18"/>
               </w:rPr>
-              <w:t>Purchase requisition no.</w:t>
+              <w:t>iv)  Quantity:</w:t>
             </w:r>
           </w:p>
         </w:tc>
         <w:tc>
           <w:tcPr>
-            <w:tcW w:type="dxa" w:w="6624"/>
+            <w:tcW w:type="dxa" w:w="5861"/>
             <w:tcMar>
-              <w:top w:w="120" w:type="dxa"/>
-              <w:bottom w:w="120" w:type="dxa"/>
-              <w:left w:w="180" w:type="dxa"/>
-              <w:right w:w="180" w:type="dxa"/>
+              <w:top w:w="35" w:type="dxa"/>
+              <w:bottom w:w="35" w:type="dxa"/>
+              <w:left w:w="60" w:type="dxa"/>
+              <w:right w:w="60" w:type="dxa"/>
             </w:tcMar>
           </w:tcPr>
           <w:p>
             <w:pPr>
-              <w:spacing w:before="40" w:after="40"/>
+              <w:spacing w:after="0"/>
             </w:pPr>
             <w:r>
-              <w:t>SMS/23/075</w:t>
+              <w:rPr>
+                <w:sz w:val="18"/>
+              </w:rPr>
+              <w:t>31,000 MT, Tolerance: +/- 25%</w:t>
             </w:r>
           </w:p>
         </w:tc>
@@ -197,42 +484,46 @@
       <w:tr>
         <w:tc>
           <w:tcPr>
-            <w:tcW w:type="dxa" w:w="3744"/>
+            <w:tcW w:type="dxa" w:w="4176"/>
             <w:tcMar>
-              <w:top w:w="120" w:type="dxa"/>
-              <w:bottom w:w="120" w:type="dxa"/>
-              <w:left w:w="180" w:type="dxa"/>
-              <w:right w:w="180" w:type="dxa"/>
+              <w:top w:w="35" w:type="dxa"/>
+              <w:bottom w:w="35" w:type="dxa"/>
+              <w:left w:w="60" w:type="dxa"/>
+              <w:right w:w="60" w:type="dxa"/>
             </w:tcMar>
           </w:tcPr>
           <w:p>
             <w:pPr>
-              <w:spacing w:before="40" w:after="40"/>
+              <w:spacing w:after="0"/>
             </w:pPr>
             <w:r>
               <w:rPr>
-                <w:b/>
+                <w:sz w:val="18"/>
               </w:rPr>
-              <w:t>Indent reference no.</w:t>
+              <w:t>v)   Estimated Cost</w:t>
             </w:r>
           </w:p>
         </w:tc>
         <w:tc>
           <w:tcPr>
-            <w:tcW w:type="dxa" w:w="6624"/>
+            <w:tcW w:type="dxa" w:w="5861"/>
             <w:tcMar>
-              <w:top w:w="120" w:type="dxa"/>
-              <w:bottom w:w="120" w:type="dxa"/>
-              <w:left w:w="180" w:type="dxa"/>
-              <w:right w:w="180" w:type="dxa"/>
+              <w:top w:w="35" w:type="dxa"/>
+              <w:bottom w:w="35" w:type="dxa"/>
+              <w:left w:w="60" w:type="dxa"/>
+              <w:right w:w="60" w:type="dxa"/>
             </w:tcMar>
           </w:tcPr>
           <w:p>
             <w:pPr>
-              <w:spacing w:before="40" w:after="40"/>
+              <w:spacing w:after="0"/>
+              <w:jc w:val="right"/>
             </w:pPr>
             <w:r>
-              <w:t>SMS/25/002</w:t>
+              <w:rPr>
+                <w:sz w:val="18"/>
+              </w:rPr>
+              <w:t>Rs.1,32,27,32,800/-</w:t>
             </w:r>
           </w:p>
         </w:tc>
@@ -240,42 +531,45 @@
       <w:tr>
         <w:tc>
           <w:tcPr>
-            <w:tcW w:type="dxa" w:w="3744"/>
+            <w:tcW w:type="dxa" w:w="4176"/>
             <w:tcMar>
-              <w:top w:w="120" w:type="dxa"/>
-              <w:bottom w:w="120" w:type="dxa"/>
-              <w:left w:w="180" w:type="dxa"/>
-              <w:right w:w="180" w:type="dxa"/>
+              <w:top w:w="35" w:type="dxa"/>
+              <w:bottom w:w="35" w:type="dxa"/>
+              <w:left w:w="60" w:type="dxa"/>
+              <w:right w:w="60" w:type="dxa"/>
             </w:tcMar>
           </w:tcPr>
           <w:p>
             <w:pPr>
-              <w:spacing w:before="40" w:after="40"/>
+              <w:spacing w:after="0"/>
             </w:pPr>
             <w:r>
               <w:rPr>
-                <w:b/>
+                <w:sz w:val="18"/>
               </w:rPr>
-              <w:t>Indent date</w:t>
+              <w:t>vi)  Delivery Period</w:t>
             </w:r>
           </w:p>
         </w:tc>
         <w:tc>
           <w:tcPr>
-            <w:tcW w:type="dxa" w:w="6624"/>
+            <w:tcW w:type="dxa" w:w="5861"/>
             <w:tcMar>
-              <w:top w:w="120" w:type="dxa"/>
-              <w:bottom w:w="120" w:type="dxa"/>
-              <w:left w:w="180" w:type="dxa"/>
-              <w:right w:w="180" w:type="dxa"/>
+              <w:top w:w="35" w:type="dxa"/>
+              <w:bottom w:w="35" w:type="dxa"/>
+              <w:left w:w="60" w:type="dxa"/>
+              <w:right w:w="60" w:type="dxa"/>
             </w:tcMar>
           </w:tcPr>
           <w:p>
             <w:pPr>
-              <w:spacing w:before="40" w:after="40"/>
+              <w:spacing w:after="0"/>
             </w:pPr>
             <w:r>
-              <w:t>11/04/2025</w:t>
+              <w:rPr>
+                <w:sz w:val="18"/>
+              </w:rPr>
+              <w:t>One month (staggered delivery)</w:t>
             </w:r>
           </w:p>
         </w:tc>
@@ -283,42 +577,46 @@
       <w:tr>
         <w:tc>
           <w:tcPr>
-            <w:tcW w:type="dxa" w:w="3744"/>
+            <w:tcW w:type="dxa" w:w="4176"/>
             <w:tcMar>
-              <w:top w:w="120" w:type="dxa"/>
-              <w:bottom w:w="120" w:type="dxa"/>
-              <w:left w:w="180" w:type="dxa"/>
-              <w:right w:w="180" w:type="dxa"/>
+              <w:top w:w="35" w:type="dxa"/>
+              <w:bottom w:w="35" w:type="dxa"/>
+              <w:left w:w="60" w:type="dxa"/>
+              <w:right w:w="60" w:type="dxa"/>
             </w:tcMar>
           </w:tcPr>
           <w:p>
             <w:pPr>
-              <w:spacing w:before="40" w:after="40"/>
+              <w:spacing w:after="0"/>
             </w:pPr>
             <w:r>
               <w:rPr>
-                <w:b/>
+                <w:sz w:val="18"/>
               </w:rPr>
-              <w:t>Proposal date</w:t>
+              <w:t>vii) EMD</w:t>
             </w:r>
           </w:p>
         </w:tc>
         <w:tc>
           <w:tcPr>
-            <w:tcW w:type="dxa" w:w="6624"/>
+            <w:tcW w:type="dxa" w:w="5861"/>
             <w:tcMar>
-              <w:top w:w="120" w:type="dxa"/>
-              <w:bottom w:w="120" w:type="dxa"/>
-              <w:left w:w="180" w:type="dxa"/>
-              <w:right w:w="180" w:type="dxa"/>
+              <w:top w:w="35" w:type="dxa"/>
+              <w:bottom w:w="35" w:type="dxa"/>
+              <w:left w:w="60" w:type="dxa"/>
+              <w:right w:w="60" w:type="dxa"/>
             </w:tcMar>
           </w:tcPr>
           <w:p>
             <w:pPr>
-              <w:spacing w:before="40" w:after="40"/>
+              <w:spacing w:after="0"/>
+              <w:jc w:val="right"/>
             </w:pPr>
             <w:r>
-              <w:t>29-03-2025</w:t>
+              <w:rPr>
+                <w:sz w:val="18"/>
+              </w:rPr>
+              <w:t>Rs.10,00,000/-</w:t>
             </w:r>
           </w:p>
         </w:tc>
@@ -326,42 +624,45 @@
       <w:tr>
         <w:tc>
           <w:tcPr>
-            <w:tcW w:type="dxa" w:w="3744"/>
+            <w:tcW w:type="dxa" w:w="4176"/>
             <w:tcMar>
-              <w:top w:w="120" w:type="dxa"/>
-              <w:bottom w:w="120" w:type="dxa"/>
-              <w:left w:w="180" w:type="dxa"/>
-              <w:right w:w="180" w:type="dxa"/>
+              <w:top w:w="35" w:type="dxa"/>
+              <w:bottom w:w="35" w:type="dxa"/>
+              <w:left w:w="60" w:type="dxa"/>
+              <w:right w:w="60" w:type="dxa"/>
             </w:tcMar>
           </w:tcPr>
           <w:p>
             <w:pPr>
-              <w:spacing w:before="40" w:after="40"/>
+              <w:spacing w:after="0"/>
             </w:pPr>
             <w:r>
               <w:rPr>
-                <w:b/>
+                <w:sz w:val="18"/>
               </w:rPr>
-              <w:t>Indent raised by</w:t>
+              <w:t>viii) Distribution of order</w:t>
             </w:r>
           </w:p>
         </w:tc>
         <w:tc>
           <w:tcPr>
-            <w:tcW w:type="dxa" w:w="6624"/>
+            <w:tcW w:type="dxa" w:w="5861"/>
             <w:tcMar>
-              <w:top w:w="120" w:type="dxa"/>
-              <w:bottom w:w="120" w:type="dxa"/>
-              <w:left w:w="180" w:type="dxa"/>
-              <w:right w:w="180" w:type="dxa"/>
+              <w:top w:w="35" w:type="dxa"/>
+              <w:bottom w:w="35" w:type="dxa"/>
+              <w:left w:w="60" w:type="dxa"/>
+              <w:right w:w="60" w:type="dxa"/>
             </w:tcMar>
           </w:tcPr>
           <w:p>
             <w:pPr>
-              <w:spacing w:before="40" w:after="40"/>
+              <w:spacing w:after="0"/>
             </w:pPr>
             <w:r>
-              <w:t>THANIARASUM N, GM(SMS-OPN)</w:t>
+              <w:rPr>
+                <w:sz w:val="18"/>
+              </w:rPr>
+              <w:t>Order shall be placed on three parties</w:t>
             </w:r>
           </w:p>
         </w:tc>
@@ -369,42 +670,45 @@
       <w:tr>
         <w:tc>
           <w:tcPr>
-            <w:tcW w:type="dxa" w:w="3744"/>
+            <w:tcW w:type="dxa" w:w="4176"/>
             <w:tcMar>
-              <w:top w:w="120" w:type="dxa"/>
-              <w:bottom w:w="120" w:type="dxa"/>
-              <w:left w:w="180" w:type="dxa"/>
-              <w:right w:w="180" w:type="dxa"/>
+              <w:top w:w="35" w:type="dxa"/>
+              <w:bottom w:w="35" w:type="dxa"/>
+              <w:left w:w="60" w:type="dxa"/>
+              <w:right w:w="60" w:type="dxa"/>
             </w:tcMar>
           </w:tcPr>
           <w:p>
             <w:pPr>
-              <w:spacing w:before="40" w:after="40"/>
+              <w:spacing w:after="0"/>
             </w:pPr>
             <w:r>
               <w:rPr>
-                <w:b/>
+                <w:sz w:val="18"/>
               </w:rPr>
-              <w:t>Estimate</w:t>
+              <w:t>ix)  Security Deposit</w:t>
             </w:r>
           </w:p>
         </w:tc>
         <w:tc>
           <w:tcPr>
-            <w:tcW w:type="dxa" w:w="6624"/>
+            <w:tcW w:type="dxa" w:w="5861"/>
             <w:tcMar>
-              <w:top w:w="120" w:type="dxa"/>
-              <w:bottom w:w="120" w:type="dxa"/>
-              <w:left w:w="180" w:type="dxa"/>
-              <w:right w:w="180" w:type="dxa"/>
+              <w:top w:w="35" w:type="dxa"/>
+              <w:bottom w:w="35" w:type="dxa"/>
+              <w:left w:w="60" w:type="dxa"/>
+              <w:right w:w="60" w:type="dxa"/>
             </w:tcMar>
           </w:tcPr>
           <w:p>
             <w:pPr>
-              <w:spacing w:before="40" w:after="40"/>
+              <w:spacing w:after="0"/>
             </w:pPr>
             <w:r>
-              <w:t>₹ 1,32,27,32,800/-</w:t>
+              <w:rPr>
+                <w:sz w:val="18"/>
+              </w:rPr>
+              <w:t>3% of Total Order Value</w:t>
             </w:r>
           </w:p>
         </w:tc>
@@ -412,42 +716,45 @@
       <w:tr>
         <w:tc>
           <w:tcPr>
-            <w:tcW w:type="dxa" w:w="3744"/>
+            <w:tcW w:type="dxa" w:w="4176"/>
             <w:tcMar>
-              <w:top w:w="120" w:type="dxa"/>
-              <w:bottom w:w="120" w:type="dxa"/>
-              <w:left w:w="180" w:type="dxa"/>
-              <w:right w:w="180" w:type="dxa"/>
+              <w:top w:w="35" w:type="dxa"/>
+              <w:bottom w:w="35" w:type="dxa"/>
+              <w:left w:w="60" w:type="dxa"/>
+              <w:right w:w="60" w:type="dxa"/>
             </w:tcMar>
           </w:tcPr>
           <w:p>
             <w:pPr>
-              <w:spacing w:before="40" w:after="40"/>
+              <w:spacing w:after="0"/>
             </w:pPr>
             <w:r>
               <w:rPr>
-                <w:b/>
+                <w:sz w:val="18"/>
               </w:rPr>
-              <w:t>Basis of estimate</w:t>
+              <w:t>x)   Price Discovery</w:t>
             </w:r>
           </w:p>
         </w:tc>
         <w:tc>
           <w:tcPr>
-            <w:tcW w:type="dxa" w:w="6624"/>
+            <w:tcW w:type="dxa" w:w="5861"/>
             <w:tcMar>
-              <w:top w:w="120" w:type="dxa"/>
-              <w:bottom w:w="120" w:type="dxa"/>
-              <w:left w:w="180" w:type="dxa"/>
-              <w:right w:w="180" w:type="dxa"/>
+              <w:top w:w="35" w:type="dxa"/>
+              <w:bottom w:w="35" w:type="dxa"/>
+              <w:left w:w="60" w:type="dxa"/>
+              <w:right w:w="60" w:type="dxa"/>
             </w:tcMar>
           </w:tcPr>
           <w:p>
             <w:pPr>
-              <w:spacing w:before="40" w:after="40"/>
+              <w:spacing w:after="0"/>
             </w:pPr>
             <w:r>
-              <w:t>The last purchase price vide AT ref. A412032/F1,F2,F3 dated 24.03.25 placed on M/s KSJ Recyclers Private Limited, Chennai, M/s Shabro Metallic Pvt. Ltd., Chennai and M/s MTC Business Pvt. Ltd., Mumbai, respectively at the landed rate of Rs. 42,668.80 per MT.</w:t>
+              <w:rPr>
+                <w:sz w:val="18"/>
+              </w:rPr>
+              <w:t>Monthly basis or as per SSP's production requirement</w:t>
             </w:r>
           </w:p>
         </w:tc>
@@ -455,42 +762,45 @@
       <w:tr>
         <w:tc>
           <w:tcPr>
-            <w:tcW w:type="dxa" w:w="3744"/>
+            <w:tcW w:type="dxa" w:w="4176"/>
             <w:tcMar>
-              <w:top w:w="120" w:type="dxa"/>
-              <w:bottom w:w="120" w:type="dxa"/>
-              <w:left w:w="180" w:type="dxa"/>
-              <w:right w:w="180" w:type="dxa"/>
+              <w:top w:w="35" w:type="dxa"/>
+              <w:bottom w:w="35" w:type="dxa"/>
+              <w:left w:w="60" w:type="dxa"/>
+              <w:right w:w="60" w:type="dxa"/>
             </w:tcMar>
           </w:tcPr>
           <w:p>
             <w:pPr>
-              <w:spacing w:before="40" w:after="40"/>
+              <w:spacing w:after="0"/>
             </w:pPr>
             <w:r>
               <w:rPr>
-                <w:b/>
+                <w:sz w:val="18"/>
               </w:rPr>
-              <w:t>First time procurement</w:t>
+              <w:t>xi)  Quantity for each Price Discovery</w:t>
             </w:r>
           </w:p>
         </w:tc>
         <w:tc>
           <w:tcPr>
-            <w:tcW w:type="dxa" w:w="6624"/>
+            <w:tcW w:type="dxa" w:w="5861"/>
             <w:tcMar>
-              <w:top w:w="120" w:type="dxa"/>
-              <w:bottom w:w="120" w:type="dxa"/>
-              <w:left w:w="180" w:type="dxa"/>
-              <w:right w:w="180" w:type="dxa"/>
+              <w:top w:w="35" w:type="dxa"/>
+              <w:bottom w:w="35" w:type="dxa"/>
+              <w:left w:w="60" w:type="dxa"/>
+              <w:right w:w="60" w:type="dxa"/>
             </w:tcMar>
           </w:tcPr>
           <w:p>
             <w:pPr>
-              <w:spacing w:before="40" w:after="40"/>
+              <w:spacing w:after="0"/>
             </w:pPr>
             <w:r>
-              <w:t>Existing Item (Repeat annual bulk scrap procurement)</w:t>
+              <w:rPr>
+                <w:sz w:val="18"/>
+              </w:rPr>
+              <w:t>4000 MT or as per SSP's production requirement</w:t>
             </w:r>
           </w:p>
         </w:tc>
@@ -498,42 +808,45 @@
       <w:tr>
         <w:tc>
           <w:tcPr>
-            <w:tcW w:type="dxa" w:w="3744"/>
+            <w:tcW w:type="dxa" w:w="4176"/>
             <w:tcMar>
-              <w:top w:w="120" w:type="dxa"/>
-              <w:bottom w:w="120" w:type="dxa"/>
-              <w:left w:w="180" w:type="dxa"/>
-              <w:right w:w="180" w:type="dxa"/>
+              <w:top w:w="35" w:type="dxa"/>
+              <w:bottom w:w="35" w:type="dxa"/>
+              <w:left w:w="60" w:type="dxa"/>
+              <w:right w:w="60" w:type="dxa"/>
             </w:tcMar>
           </w:tcPr>
           <w:p>
             <w:pPr>
-              <w:spacing w:before="40" w:after="40"/>
+              <w:spacing w:after="0"/>
             </w:pPr>
             <w:r>
               <w:rPr>
-                <w:b/>
+                <w:sz w:val="18"/>
               </w:rPr>
-              <w:t>Number of budgetary offers received</w:t>
+              <w:t>xii) Mode of Tender</w:t>
             </w:r>
           </w:p>
         </w:tc>
         <w:tc>
           <w:tcPr>
-            <w:tcW w:type="dxa" w:w="6624"/>
+            <w:tcW w:type="dxa" w:w="5861"/>
             <w:tcMar>
-              <w:top w:w="120" w:type="dxa"/>
-              <w:bottom w:w="120" w:type="dxa"/>
-              <w:left w:w="180" w:type="dxa"/>
-              <w:right w:w="180" w:type="dxa"/>
+              <w:top w:w="35" w:type="dxa"/>
+              <w:bottom w:w="35" w:type="dxa"/>
+              <w:left w:w="60" w:type="dxa"/>
+              <w:right w:w="60" w:type="dxa"/>
             </w:tcMar>
           </w:tcPr>
           <w:p>
             <w:pPr>
-              <w:spacing w:before="40" w:after="40"/>
+              <w:spacing w:after="0"/>
             </w:pPr>
             <w:r>
-              <w:t>Empanelled suppliers offers through EPS Reverse Auction (LPP benchmarked from 3 parties: M/s KSJ Recyclers, M/s Shabro Metallic, M/s MTC Business)</w:t>
+              <w:rPr>
+                <w:sz w:val="18"/>
+              </w:rPr>
+              <w:t>Open Tender (Two Stage)</w:t>
             </w:r>
           </w:p>
         </w:tc>
@@ -541,25 +854,214 @@
       <w:tr>
         <w:tc>
           <w:tcPr>
-            <w:tcW w:type="dxa" w:w="6624"/>
-            <w:gridSpan w:val="2"/>
-            <w:shd w:fill="E2E8F0"/>
+            <w:tcW w:type="dxa" w:w="4176"/>
             <w:tcMar>
-              <w:top w:w="120" w:type="dxa"/>
-              <w:bottom w:w="120" w:type="dxa"/>
-              <w:left w:w="180" w:type="dxa"/>
-              <w:right w:w="180" w:type="dxa"/>
+              <w:top w:w="35" w:type="dxa"/>
+              <w:bottom w:w="35" w:type="dxa"/>
+              <w:left w:w="60" w:type="dxa"/>
+              <w:right w:w="60" w:type="dxa"/>
             </w:tcMar>
           </w:tcPr>
           <w:p>
             <w:pPr>
-              <w:spacing w:before="60" w:after="60"/>
+              <w:spacing w:after="0"/>
+            </w:pPr>
+            <w:r>
+              <w:rPr>
+                <w:sz w:val="18"/>
+              </w:rPr>
+              <w:t>xiii) Approving Authority</w:t>
+            </w:r>
+          </w:p>
+        </w:tc>
+        <w:tc>
+          <w:tcPr>
+            <w:tcW w:type="dxa" w:w="5861"/>
+            <w:tcMar>
+              <w:top w:w="35" w:type="dxa"/>
+              <w:bottom w:w="35" w:type="dxa"/>
+              <w:left w:w="60" w:type="dxa"/>
+              <w:right w:w="60" w:type="dxa"/>
+            </w:tcMar>
+          </w:tcPr>
+          <w:p>
+            <w:pPr>
+              <w:spacing w:after="0"/>
+            </w:pPr>
+            <w:r>
+              <w:rPr>
+                <w:sz w:val="18"/>
+              </w:rPr>
+              <w:t>Chief Executive</w:t>
+            </w:r>
+          </w:p>
+        </w:tc>
+      </w:tr>
+    </w:tbl>
+    <w:p>
+      <w:pPr>
+        <w:spacing w:before="120" w:after="60"/>
+      </w:pPr>
+      <w:r>
+        <w:rPr>
+          <w:sz w:val="18"/>
+        </w:rPr>
+        <w:t>1. Based on the Task Force Committee (TFC) recommendation, the above referred indent (Annexure I) was received from SMS Operation for procurement of 31,000 MT (Quantity Tolerance: up to +/- 25%) of "MS Scrap- Shredded" on Open Tender basis at an estimated value of Rs.1,32,27,32,800/- (Annexure II) with price discovery on monthly basis with placement of order on three parties.</w:t>
+      </w:r>
+    </w:p>
+    <w:p>
+      <w:pPr>
+        <w:spacing w:before="60" w:after="60"/>
+      </w:pPr>
+      <w:r>
+        <w:rPr>
+          <w:sz w:val="18"/>
+        </w:rPr>
+        <w:t>2. The estimate is based on LPP at Rs.36,160/- PMT (excluding GST) vide PO dated: 24/03/2025 enclosed as Annexure III. The last three years actual consumption enclosed as Annexure-IV is tabulated below</w:t>
+      </w:r>
+    </w:p>
+    <w:tbl>
+      <w:tblPr>
+        <w:tblW w:type="auto" w:w="0"/>
+        <w:jc w:val="center"/>
+        <w:tblLayout w:type="fixed"/>
+        <w:tblLook w:firstColumn="1" w:firstRow="1" w:lastColumn="0" w:lastRow="0" w:noHBand="0" w:noVBand="1" w:val="04A0"/>
+        <w:tblBorders>
+          <w:top w:val="single" w:sz="4" w:space="0" w:color="000000"/>
+          <w:left w:val="single" w:sz="4" w:space="0" w:color="000000"/>
+          <w:bottom w:val="single" w:sz="4" w:space="0" w:color="000000"/>
+          <w:right w:val="single" w:sz="4" w:space="0" w:color="000000"/>
+          <w:insideH w:val="single" w:sz="4" w:space="0" w:color="000000"/>
+          <w:insideV w:val="single" w:sz="4" w:space="0" w:color="000000"/>
+        </w:tblBorders>
+      </w:tblPr>
+      <w:tblGrid>
+        <w:gridCol w:w="2007"/>
+        <w:gridCol w:w="2007"/>
+        <w:gridCol w:w="2007"/>
+        <w:gridCol w:w="2007"/>
+        <w:gridCol w:w="2007"/>
+      </w:tblGrid>
+      <w:tr>
+        <w:tc>
+          <w:tcPr>
+            <w:tcW w:type="dxa" w:w="1728"/>
+            <w:tcMar>
+              <w:top w:w="40" w:type="dxa"/>
+              <w:bottom w:w="40" w:type="dxa"/>
+              <w:left w:w="40" w:type="dxa"/>
+              <w:right w:w="40" w:type="dxa"/>
+            </w:tcMar>
+          </w:tcPr>
+          <w:p>
+            <w:pPr>
+              <w:spacing w:after="0"/>
+              <w:jc w:val="center"/>
             </w:pPr>
             <w:r>
               <w:rPr>
                 <w:b/>
+                <w:sz w:val="17"/>
               </w:rPr>
-              <w:t>Previous purchase details:</w:t>
+              <w:t>Financial Year</w:t>
+            </w:r>
+          </w:p>
+        </w:tc>
+        <w:tc>
+          <w:tcPr>
+            <w:tcW w:type="dxa" w:w="2592"/>
+            <w:tcMar>
+              <w:top w:w="40" w:type="dxa"/>
+              <w:bottom w:w="40" w:type="dxa"/>
+              <w:left w:w="40" w:type="dxa"/>
+              <w:right w:w="40" w:type="dxa"/>
+            </w:tcMar>
+          </w:tcPr>
+          <w:p>
+            <w:pPr>
+              <w:spacing w:after="0"/>
+              <w:jc w:val="center"/>
+            </w:pPr>
+            <w:r>
+              <w:rPr>
+                <w:b/>
+                <w:sz w:val="17"/>
+              </w:rPr>
+              <w:t>Consumption of MS-Shredded Scrap (MT)</w:t>
+            </w:r>
+          </w:p>
+        </w:tc>
+        <w:tc>
+          <w:tcPr>
+            <w:tcW w:type="dxa" w:w="2016"/>
+            <w:tcMar>
+              <w:top w:w="40" w:type="dxa"/>
+              <w:bottom w:w="40" w:type="dxa"/>
+              <w:left w:w="40" w:type="dxa"/>
+              <w:right w:w="40" w:type="dxa"/>
+            </w:tcMar>
+          </w:tcPr>
+          <w:p>
+            <w:pPr>
+              <w:spacing w:after="0"/>
+              <w:jc w:val="center"/>
+            </w:pPr>
+            <w:r>
+              <w:rPr>
+                <w:b/>
+                <w:sz w:val="17"/>
+              </w:rPr>
+              <w:t>Slab Production (MT)</w:t>
+            </w:r>
+          </w:p>
+        </w:tc>
+        <w:tc>
+          <w:tcPr>
+            <w:tcW w:type="dxa" w:w="1440"/>
+            <w:tcMar>
+              <w:top w:w="40" w:type="dxa"/>
+              <w:bottom w:w="40" w:type="dxa"/>
+              <w:left w:w="40" w:type="dxa"/>
+              <w:right w:w="40" w:type="dxa"/>
+            </w:tcMar>
+          </w:tcPr>
+          <w:p>
+            <w:pPr>
+              <w:spacing w:after="0"/>
+              <w:jc w:val="center"/>
+            </w:pPr>
+            <w:r>
+              <w:rPr>
+                <w:b/>
+                <w:sz w:val="17"/>
+              </w:rPr>
+              <w:t>No.of Converters</w:t>
+            </w:r>
+          </w:p>
+        </w:tc>
+        <w:tc>
+          <w:tcPr>
+            <w:tcW w:type="dxa" w:w="2261"/>
+            <w:tcMar>
+              <w:top w:w="40" w:type="dxa"/>
+              <w:bottom w:w="40" w:type="dxa"/>
+              <w:left w:w="40" w:type="dxa"/>
+              <w:right w:w="40" w:type="dxa"/>
+            </w:tcMar>
+          </w:tcPr>
+          <w:p>
+            <w:pPr>
+              <w:spacing w:after="0"/>
+              <w:jc w:val="center"/>
+            </w:pPr>
+            <w:r>
+              <w:rPr>
+                <w:b/>
+                <w:sz w:val="17"/>
+              </w:rPr>
+              <w:t>Specific Consumption</w:t>
+              <w:br/>
+              <w:t>(MT/Converter)</w:t>
             </w:r>
           </w:p>
         </w:tc>
@@ -567,233 +1069,116 @@
       <w:tr>
         <w:tc>
           <w:tcPr>
-            <w:tcW w:type="dxa" w:w="6624"/>
-            <w:gridSpan w:val="2"/>
+            <w:tcW w:type="dxa" w:w="1728"/>
             <w:tcMar>
-              <w:top w:w="60" w:type="dxa"/>
-              <w:bottom w:w="60" w:type="dxa"/>
-              <w:left w:w="60" w:type="dxa"/>
-              <w:right w:w="60" w:type="dxa"/>
-            </w:tcMar>
-          </w:tcPr>
-          <w:p/>
-          <w:tbl>
-            <w:tblPr>
-              <w:tblW w:type="auto" w:w="0"/>
-              <w:jc w:val="center"/>
-              <w:tblLook w:firstColumn="1" w:firstRow="1" w:lastColumn="0" w:lastRow="0" w:noHBand="0" w:noVBand="1" w:val="04A0"/>
-              <w:tblBorders>
-                <w:top w:val="single" w:sz="4" w:space="0" w:color="CBD5E1"/>
-                <w:left w:val="single" w:sz="4" w:space="0" w:color="CBD5E1"/>
-                <w:bottom w:val="single" w:sz="4" w:space="0" w:color="CBD5E1"/>
-                <w:right w:val="single" w:sz="4" w:space="0" w:color="CBD5E1"/>
-                <w:insideH w:val="single" w:sz="4" w:space="0" w:color="CBD5E1"/>
-                <w:insideV w:val="single" w:sz="4" w:space="0" w:color="CBD5E1"/>
-              </w:tblBorders>
-            </w:tblPr>
-            <w:tblGrid>
-              <w:gridCol w:w="2628"/>
-              <w:gridCol w:w="2628"/>
-              <w:gridCol w:w="2628"/>
-              <w:gridCol w:w="2628"/>
-            </w:tblGrid>
-            <w:tr>
-              <w:tc>
-                <w:tcPr>
-                  <w:tcW w:type="dxa" w:w="2628"/>
-                  <w:shd w:fill="F1F5F9"/>
-                  <w:tcMar>
-                    <w:top w:w="120" w:type="dxa"/>
-                    <w:bottom w:w="120" w:type="dxa"/>
-                    <w:left w:w="180" w:type="dxa"/>
-                    <w:right w:w="180" w:type="dxa"/>
-                  </w:tcMar>
-                </w:tcPr>
-                <w:p>
-                  <w:r>
-                    <w:rPr>
-                      <w:b/>
-                    </w:rPr>
-                    <w:t>Item sl. nos.</w:t>
-                  </w:r>
-                </w:p>
-              </w:tc>
-              <w:tc>
-                <w:tcPr>
-                  <w:tcW w:type="dxa" w:w="2628"/>
-                  <w:shd w:fill="F1F5F9"/>
-                  <w:tcMar>
-                    <w:top w:w="120" w:type="dxa"/>
-                    <w:bottom w:w="120" w:type="dxa"/>
-                    <w:left w:w="180" w:type="dxa"/>
-                    <w:right w:w="180" w:type="dxa"/>
-                  </w:tcMar>
-                </w:tcPr>
-                <w:p>
-                  <w:r>
-                    <w:rPr>
-                      <w:b/>
-                    </w:rPr>
-                    <w:t>AT ref. no.</w:t>
-                  </w:r>
-                </w:p>
-              </w:tc>
-              <w:tc>
-                <w:tcPr>
-                  <w:tcW w:type="dxa" w:w="2628"/>
-                  <w:shd w:fill="F1F5F9"/>
-                  <w:tcMar>
-                    <w:top w:w="120" w:type="dxa"/>
-                    <w:bottom w:w="120" w:type="dxa"/>
-                    <w:left w:w="180" w:type="dxa"/>
-                    <w:right w:w="180" w:type="dxa"/>
-                  </w:tcMar>
-                </w:tcPr>
-                <w:p>
-                  <w:r>
-                    <w:rPr>
-                      <w:b/>
-                    </w:rPr>
-                    <w:t>Previous purchase qty in nos./MT</w:t>
-                  </w:r>
-                </w:p>
-              </w:tc>
-              <w:tc>
-                <w:tcPr>
-                  <w:tcW w:type="dxa" w:w="2628"/>
-                  <w:shd w:fill="F1F5F9"/>
-                  <w:tcMar>
-                    <w:top w:w="120" w:type="dxa"/>
-                    <w:bottom w:w="120" w:type="dxa"/>
-                    <w:left w:w="180" w:type="dxa"/>
-                    <w:right w:w="180" w:type="dxa"/>
-                  </w:tcMar>
-                </w:tcPr>
-                <w:p>
-                  <w:r>
-                    <w:rPr>
-                      <w:b/>
-                    </w:rPr>
-                    <w:t>Unit rate incl. GST</w:t>
-                  </w:r>
-                </w:p>
-              </w:tc>
-            </w:tr>
-            <w:tr>
-              <w:tc>
-                <w:tcPr>
-                  <w:tcW w:type="dxa" w:w="2628"/>
-                  <w:tcMar>
-                    <w:top w:w="120" w:type="dxa"/>
-                    <w:bottom w:w="120" w:type="dxa"/>
-                    <w:left w:w="180" w:type="dxa"/>
-                    <w:right w:w="180" w:type="dxa"/>
-                  </w:tcMar>
-                </w:tcPr>
-                <w:p>
-                  <w:r>
-                    <w:rPr>
-                      <w:b/>
-                    </w:rPr>
-                    <w:t>1</w:t>
-                  </w:r>
-                </w:p>
-              </w:tc>
-              <w:tc>
-                <w:tcPr>
-                  <w:tcW w:type="dxa" w:w="2628"/>
-                  <w:tcMar>
-                    <w:top w:w="120" w:type="dxa"/>
-                    <w:bottom w:w="120" w:type="dxa"/>
-                    <w:left w:w="180" w:type="dxa"/>
-                    <w:right w:w="180" w:type="dxa"/>
-                  </w:tcMar>
-                </w:tcPr>
-                <w:p>
-                  <w:r>
-                    <w:t>A412032/F1,F2,F3 dated 24.03.2025 (M/s KSJ Recyclers, M/s Shabro Metallic, M/s MTC Business)</w:t>
-                  </w:r>
-                </w:p>
-              </w:tc>
-              <w:tc>
-                <w:tcPr>
-                  <w:tcW w:type="dxa" w:w="2628"/>
-                  <w:tcMar>
-                    <w:top w:w="120" w:type="dxa"/>
-                    <w:bottom w:w="120" w:type="dxa"/>
-                    <w:left w:w="180" w:type="dxa"/>
-                    <w:right w:w="180" w:type="dxa"/>
-                  </w:tcMar>
-                </w:tcPr>
-                <w:p>
-                  <w:r>
-                    <w:t>31,000 MT</w:t>
-                  </w:r>
-                </w:p>
-              </w:tc>
-              <w:tc>
-                <w:tcPr>
-                  <w:tcW w:type="dxa" w:w="2628"/>
-                  <w:tcMar>
-                    <w:top w:w="120" w:type="dxa"/>
-                    <w:bottom w:w="120" w:type="dxa"/>
-                    <w:left w:w="180" w:type="dxa"/>
-                    <w:right w:w="180" w:type="dxa"/>
-                  </w:tcMar>
-                </w:tcPr>
-                <w:p>
-                  <w:r>
-                    <w:rPr>
-                      <w:b/>
-                    </w:rPr>
-                    <w:t>₹ 42,669/- per MT</w:t>
-                  </w:r>
-                </w:p>
-              </w:tc>
-            </w:tr>
-          </w:tbl>
-          <w:p/>
-        </w:tc>
-      </w:tr>
-      <w:tr>
-        <w:tc>
-          <w:tcPr>
-            <w:tcW w:type="dxa" w:w="3744"/>
-            <w:tcMar>
-              <w:top w:w="120" w:type="dxa"/>
-              <w:bottom w:w="120" w:type="dxa"/>
-              <w:left w:w="180" w:type="dxa"/>
-              <w:right w:w="180" w:type="dxa"/>
+              <w:top w:w="30" w:type="dxa"/>
+              <w:bottom w:w="30" w:type="dxa"/>
+              <w:left w:w="40" w:type="dxa"/>
+              <w:right w:w="40" w:type="dxa"/>
             </w:tcMar>
           </w:tcPr>
           <w:p>
             <w:pPr>
-              <w:spacing w:before="40" w:after="40"/>
+              <w:spacing w:after="0"/>
+              <w:jc w:val="left"/>
             </w:pPr>
             <w:r>
               <w:rPr>
-                <w:b/>
+                <w:sz w:val="17"/>
               </w:rPr>
-              <w:t>Previous purchase mode of tender</w:t>
+              <w:t>2022-23</w:t>
             </w:r>
           </w:p>
         </w:tc>
         <w:tc>
           <w:tcPr>
-            <w:tcW w:type="dxa" w:w="6624"/>
+            <w:tcW w:type="dxa" w:w="2592"/>
             <w:tcMar>
-              <w:top w:w="120" w:type="dxa"/>
-              <w:bottom w:w="120" w:type="dxa"/>
-              <w:left w:w="180" w:type="dxa"/>
-              <w:right w:w="180" w:type="dxa"/>
+              <w:top w:w="30" w:type="dxa"/>
+              <w:bottom w:w="30" w:type="dxa"/>
+              <w:left w:w="40" w:type="dxa"/>
+              <w:right w:w="40" w:type="dxa"/>
             </w:tcMar>
           </w:tcPr>
           <w:p>
             <w:pPr>
-              <w:spacing w:before="40" w:after="40"/>
+              <w:spacing w:after="0"/>
+              <w:jc w:val="center"/>
             </w:pPr>
             <w:r>
-              <w:t>OTE THROUGH EPS (M-JUNCTION)</w:t>
+              <w:rPr>
+                <w:sz w:val="17"/>
+              </w:rPr>
+              <w:t>24477</w:t>
+            </w:r>
+          </w:p>
+        </w:tc>
+        <w:tc>
+          <w:tcPr>
+            <w:tcW w:type="dxa" w:w="2016"/>
+            <w:tcMar>
+              <w:top w:w="30" w:type="dxa"/>
+              <w:bottom w:w="30" w:type="dxa"/>
+              <w:left w:w="40" w:type="dxa"/>
+              <w:right w:w="40" w:type="dxa"/>
+            </w:tcMar>
+          </w:tcPr>
+          <w:p>
+            <w:pPr>
+              <w:spacing w:after="0"/>
+              <w:jc w:val="center"/>
+            </w:pPr>
+            <w:r>
+              <w:rPr>
+                <w:sz w:val="17"/>
+              </w:rPr>
+              <w:t>140050</w:t>
+            </w:r>
+          </w:p>
+        </w:tc>
+        <w:tc>
+          <w:tcPr>
+            <w:tcW w:type="dxa" w:w="1440"/>
+            <w:tcMar>
+              <w:top w:w="30" w:type="dxa"/>
+              <w:bottom w:w="30" w:type="dxa"/>
+              <w:left w:w="40" w:type="dxa"/>
+              <w:right w:w="40" w:type="dxa"/>
+            </w:tcMar>
+          </w:tcPr>
+          <w:p>
+            <w:pPr>
+              <w:spacing w:after="0"/>
+              <w:jc w:val="center"/>
+            </w:pPr>
+            <w:r>
+              <w:rPr>
+                <w:sz w:val="17"/>
+              </w:rPr>
+              <w:t>23</w:t>
+            </w:r>
+          </w:p>
+        </w:tc>
+        <w:tc>
+          <w:tcPr>
+            <w:tcW w:type="dxa" w:w="2261"/>
+            <w:tcMar>
+              <w:top w:w="30" w:type="dxa"/>
+              <w:bottom w:w="30" w:type="dxa"/>
+              <w:left w:w="40" w:type="dxa"/>
+              <w:right w:w="40" w:type="dxa"/>
+            </w:tcMar>
+          </w:tcPr>
+          <w:p>
+            <w:pPr>
+              <w:spacing w:after="0"/>
+              <w:jc w:val="center"/>
+            </w:pPr>
+            <w:r>
+              <w:rPr>
+                <w:sz w:val="17"/>
+              </w:rPr>
+              <w:t>1064</w:t>
             </w:r>
           </w:p>
         </w:tc>
@@ -801,25 +1186,116 @@
       <w:tr>
         <w:tc>
           <w:tcPr>
-            <w:tcW w:type="dxa" w:w="6624"/>
-            <w:gridSpan w:val="2"/>
-            <w:shd w:fill="E2E8F0"/>
+            <w:tcW w:type="dxa" w:w="1728"/>
             <w:tcMar>
-              <w:top w:w="120" w:type="dxa"/>
-              <w:bottom w:w="120" w:type="dxa"/>
-              <w:left w:w="180" w:type="dxa"/>
-              <w:right w:w="180" w:type="dxa"/>
+              <w:top w:w="30" w:type="dxa"/>
+              <w:bottom w:w="30" w:type="dxa"/>
+              <w:left w:w="40" w:type="dxa"/>
+              <w:right w:w="40" w:type="dxa"/>
             </w:tcMar>
           </w:tcPr>
           <w:p>
             <w:pPr>
-              <w:spacing w:before="60" w:after="60"/>
+              <w:spacing w:after="0"/>
+              <w:jc w:val="left"/>
             </w:pPr>
             <w:r>
               <w:rPr>
-                <w:b/>
+                <w:sz w:val="17"/>
               </w:rPr>
-              <w:t>Indent Approval</w:t>
+              <w:t>2023-24</w:t>
+            </w:r>
+          </w:p>
+        </w:tc>
+        <w:tc>
+          <w:tcPr>
+            <w:tcW w:type="dxa" w:w="2592"/>
+            <w:tcMar>
+              <w:top w:w="30" w:type="dxa"/>
+              <w:bottom w:w="30" w:type="dxa"/>
+              <w:left w:w="40" w:type="dxa"/>
+              <w:right w:w="40" w:type="dxa"/>
+            </w:tcMar>
+          </w:tcPr>
+          <w:p>
+            <w:pPr>
+              <w:spacing w:after="0"/>
+              <w:jc w:val="center"/>
+            </w:pPr>
+            <w:r>
+              <w:rPr>
+                <w:sz w:val="17"/>
+              </w:rPr>
+              <w:t>25249</w:t>
+            </w:r>
+          </w:p>
+        </w:tc>
+        <w:tc>
+          <w:tcPr>
+            <w:tcW w:type="dxa" w:w="2016"/>
+            <w:tcMar>
+              <w:top w:w="30" w:type="dxa"/>
+              <w:bottom w:w="30" w:type="dxa"/>
+              <w:left w:w="40" w:type="dxa"/>
+              <w:right w:w="40" w:type="dxa"/>
+            </w:tcMar>
+          </w:tcPr>
+          <w:p>
+            <w:pPr>
+              <w:spacing w:after="0"/>
+              <w:jc w:val="center"/>
+            </w:pPr>
+            <w:r>
+              <w:rPr>
+                <w:sz w:val="17"/>
+              </w:rPr>
+              <w:t>152493</w:t>
+            </w:r>
+          </w:p>
+        </w:tc>
+        <w:tc>
+          <w:tcPr>
+            <w:tcW w:type="dxa" w:w="1440"/>
+            <w:tcMar>
+              <w:top w:w="30" w:type="dxa"/>
+              <w:bottom w:w="30" w:type="dxa"/>
+              <w:left w:w="40" w:type="dxa"/>
+              <w:right w:w="40" w:type="dxa"/>
+            </w:tcMar>
+          </w:tcPr>
+          <w:p>
+            <w:pPr>
+              <w:spacing w:after="0"/>
+              <w:jc w:val="center"/>
+            </w:pPr>
+            <w:r>
+              <w:rPr>
+                <w:sz w:val="17"/>
+              </w:rPr>
+              <w:t>24</w:t>
+            </w:r>
+          </w:p>
+        </w:tc>
+        <w:tc>
+          <w:tcPr>
+            <w:tcW w:type="dxa" w:w="2261"/>
+            <w:tcMar>
+              <w:top w:w="30" w:type="dxa"/>
+              <w:bottom w:w="30" w:type="dxa"/>
+              <w:left w:w="40" w:type="dxa"/>
+              <w:right w:w="40" w:type="dxa"/>
+            </w:tcMar>
+          </w:tcPr>
+          <w:p>
+            <w:pPr>
+              <w:spacing w:after="0"/>
+              <w:jc w:val="center"/>
+            </w:pPr>
+            <w:r>
+              <w:rPr>
+                <w:sz w:val="17"/>
+              </w:rPr>
+              <w:t>1052</w:t>
             </w:r>
           </w:p>
         </w:tc>
@@ -827,47 +1303,116 @@
       <w:tr>
         <w:tc>
           <w:tcPr>
-            <w:tcW w:type="dxa" w:w="3744"/>
+            <w:tcW w:type="dxa" w:w="1728"/>
             <w:tcMar>
-              <w:top w:w="120" w:type="dxa"/>
-              <w:bottom w:w="120" w:type="dxa"/>
-              <w:left w:w="180" w:type="dxa"/>
-              <w:right w:w="180" w:type="dxa"/>
+              <w:top w:w="30" w:type="dxa"/>
+              <w:bottom w:w="30" w:type="dxa"/>
+              <w:left w:w="40" w:type="dxa"/>
+              <w:right w:w="40" w:type="dxa"/>
             </w:tcMar>
-            <w:shd w:fill="EDF2F7"/>
           </w:tcPr>
           <w:p>
             <w:pPr>
-              <w:spacing w:before="40" w:after="40"/>
+              <w:spacing w:after="0"/>
+              <w:jc w:val="left"/>
             </w:pPr>
             <w:r>
               <w:rPr>
-                <w:b/>
+                <w:sz w:val="17"/>
               </w:rPr>
-              <w:t>Parameter</w:t>
+              <w:t>2024-25</w:t>
             </w:r>
           </w:p>
         </w:tc>
         <w:tc>
           <w:tcPr>
-            <w:tcW w:type="dxa" w:w="6624"/>
+            <w:tcW w:type="dxa" w:w="2592"/>
             <w:tcMar>
-              <w:top w:w="120" w:type="dxa"/>
-              <w:bottom w:w="120" w:type="dxa"/>
-              <w:left w:w="180" w:type="dxa"/>
-              <w:right w:w="180" w:type="dxa"/>
+              <w:top w:w="30" w:type="dxa"/>
+              <w:bottom w:w="30" w:type="dxa"/>
+              <w:left w:w="40" w:type="dxa"/>
+              <w:right w:w="40" w:type="dxa"/>
             </w:tcMar>
-            <w:shd w:fill="EDF2F7"/>
           </w:tcPr>
           <w:p>
             <w:pPr>
-              <w:spacing w:before="40" w:after="40"/>
+              <w:spacing w:after="0"/>
+              <w:jc w:val="center"/>
             </w:pPr>
             <w:r>
               <w:rPr>
-                <w:b/>
+                <w:sz w:val="17"/>
               </w:rPr>
-              <w:t>Value</w:t>
+              <w:t>32248</w:t>
+            </w:r>
+          </w:p>
+        </w:tc>
+        <w:tc>
+          <w:tcPr>
+            <w:tcW w:type="dxa" w:w="2016"/>
+            <w:tcMar>
+              <w:top w:w="30" w:type="dxa"/>
+              <w:bottom w:w="30" w:type="dxa"/>
+              <w:left w:w="40" w:type="dxa"/>
+              <w:right w:w="40" w:type="dxa"/>
+            </w:tcMar>
+          </w:tcPr>
+          <w:p>
+            <w:pPr>
+              <w:spacing w:after="0"/>
+              <w:jc w:val="center"/>
+            </w:pPr>
+            <w:r>
+              <w:rPr>
+                <w:sz w:val="17"/>
+              </w:rPr>
+              <w:t>145891</w:t>
+            </w:r>
+          </w:p>
+        </w:tc>
+        <w:tc>
+          <w:tcPr>
+            <w:tcW w:type="dxa" w:w="1440"/>
+            <w:tcMar>
+              <w:top w:w="30" w:type="dxa"/>
+              <w:bottom w:w="30" w:type="dxa"/>
+              <w:left w:w="40" w:type="dxa"/>
+              <w:right w:w="40" w:type="dxa"/>
+            </w:tcMar>
+          </w:tcPr>
+          <w:p>
+            <w:pPr>
+              <w:spacing w:after="0"/>
+              <w:jc w:val="center"/>
+            </w:pPr>
+            <w:r>
+              <w:rPr>
+                <w:sz w:val="17"/>
+              </w:rPr>
+              <w:t>24</w:t>
+            </w:r>
+          </w:p>
+        </w:tc>
+        <w:tc>
+          <w:tcPr>
+            <w:tcW w:type="dxa" w:w="2261"/>
+            <w:tcMar>
+              <w:top w:w="30" w:type="dxa"/>
+              <w:bottom w:w="30" w:type="dxa"/>
+              <w:left w:w="40" w:type="dxa"/>
+              <w:right w:w="40" w:type="dxa"/>
+            </w:tcMar>
+          </w:tcPr>
+          <w:p>
+            <w:pPr>
+              <w:spacing w:after="0"/>
+              <w:jc w:val="center"/>
+            </w:pPr>
+            <w:r>
+              <w:rPr>
+                <w:sz w:val="17"/>
+              </w:rPr>
+              <w:t>1344</w:t>
             </w:r>
           </w:p>
         </w:tc>
@@ -875,42 +1420,224 @@
       <w:tr>
         <w:tc>
           <w:tcPr>
-            <w:tcW w:type="dxa" w:w="3744"/>
+            <w:tcW w:type="dxa" w:w="1728"/>
             <w:tcMar>
-              <w:top w:w="120" w:type="dxa"/>
-              <w:bottom w:w="120" w:type="dxa"/>
-              <w:left w:w="180" w:type="dxa"/>
-              <w:right w:w="180" w:type="dxa"/>
+              <w:top w:w="30" w:type="dxa"/>
+              <w:bottom w:w="30" w:type="dxa"/>
+              <w:left w:w="40" w:type="dxa"/>
+              <w:right w:w="40" w:type="dxa"/>
             </w:tcMar>
           </w:tcPr>
           <w:p>
             <w:pPr>
-              <w:spacing w:before="40" w:after="40"/>
+              <w:spacing w:after="0"/>
+              <w:jc w:val="left"/>
             </w:pPr>
             <w:r>
               <w:rPr>
                 <w:b/>
+                <w:sz w:val="17"/>
               </w:rPr>
-              <w:t>Approving Authority</w:t>
+              <w:t>Average</w:t>
             </w:r>
           </w:p>
         </w:tc>
         <w:tc>
           <w:tcPr>
-            <w:tcW w:type="dxa" w:w="6624"/>
+            <w:tcW w:type="dxa" w:w="2592"/>
             <w:tcMar>
-              <w:top w:w="120" w:type="dxa"/>
-              <w:bottom w:w="120" w:type="dxa"/>
-              <w:left w:w="180" w:type="dxa"/>
-              <w:right w:w="180" w:type="dxa"/>
+              <w:top w:w="30" w:type="dxa"/>
+              <w:bottom w:w="30" w:type="dxa"/>
+              <w:left w:w="40" w:type="dxa"/>
+              <w:right w:w="40" w:type="dxa"/>
             </w:tcMar>
           </w:tcPr>
           <w:p>
             <w:pPr>
-              <w:spacing w:before="40" w:after="40"/>
+              <w:spacing w:after="0"/>
+              <w:jc w:val="center"/>
             </w:pPr>
             <w:r>
-              <w:t>EXECUTIVE DIRECTOR</w:t>
+              <w:rPr>
+                <w:b/>
+                <w:sz w:val="17"/>
+              </w:rPr>
+            </w:r>
+          </w:p>
+        </w:tc>
+        <w:tc>
+          <w:tcPr>
+            <w:tcW w:type="dxa" w:w="2016"/>
+            <w:tcMar>
+              <w:top w:w="30" w:type="dxa"/>
+              <w:bottom w:w="30" w:type="dxa"/>
+              <w:left w:w="40" w:type="dxa"/>
+              <w:right w:w="40" w:type="dxa"/>
+            </w:tcMar>
+          </w:tcPr>
+          <w:p>
+            <w:pPr>
+              <w:spacing w:after="0"/>
+              <w:jc w:val="center"/>
+            </w:pPr>
+            <w:r>
+              <w:rPr>
+                <w:b/>
+                <w:sz w:val="17"/>
+              </w:rPr>
+            </w:r>
+          </w:p>
+        </w:tc>
+        <w:tc>
+          <w:tcPr>
+            <w:tcW w:type="dxa" w:w="1440"/>
+            <w:tcMar>
+              <w:top w:w="30" w:type="dxa"/>
+              <w:bottom w:w="30" w:type="dxa"/>
+              <w:left w:w="40" w:type="dxa"/>
+              <w:right w:w="40" w:type="dxa"/>
+            </w:tcMar>
+          </w:tcPr>
+          <w:p>
+            <w:pPr>
+              <w:spacing w:after="0"/>
+              <w:jc w:val="center"/>
+            </w:pPr>
+            <w:r>
+              <w:rPr>
+                <w:b/>
+                <w:sz w:val="17"/>
+              </w:rPr>
+            </w:r>
+          </w:p>
+        </w:tc>
+        <w:tc>
+          <w:tcPr>
+            <w:tcW w:type="dxa" w:w="2261"/>
+            <w:tcMar>
+              <w:top w:w="30" w:type="dxa"/>
+              <w:bottom w:w="30" w:type="dxa"/>
+              <w:left w:w="40" w:type="dxa"/>
+              <w:right w:w="40" w:type="dxa"/>
+            </w:tcMar>
+          </w:tcPr>
+          <w:p>
+            <w:pPr>
+              <w:spacing w:after="0"/>
+              <w:jc w:val="center"/>
+            </w:pPr>
+            <w:r>
+              <w:rPr>
+                <w:b/>
+                <w:sz w:val="17"/>
+              </w:rPr>
+              <w:t>1153</w:t>
+            </w:r>
+          </w:p>
+        </w:tc>
+      </w:tr>
+    </w:tbl>
+    <w:p>
+      <w:pPr>
+        <w:spacing w:before="80" w:after="60"/>
+      </w:pPr>
+      <w:r>
+        <w:rPr>
+          <w:sz w:val="18"/>
+        </w:rPr>
+        <w:t>3. The stock at site and pending supplies as on 11/04/2025 enclosed as Annexure-IV are tabulated below</w:t>
+      </w:r>
+    </w:p>
+    <w:tbl>
+      <w:tblPr>
+        <w:tblW w:type="auto" w:w="0"/>
+        <w:jc w:val="center"/>
+        <w:tblLayout w:type="fixed"/>
+        <w:tblLook w:firstColumn="1" w:firstRow="1" w:lastColumn="0" w:lastRow="0" w:noHBand="0" w:noVBand="1" w:val="04A0"/>
+        <w:tblBorders>
+          <w:top w:val="single" w:sz="4" w:space="0" w:color="000000"/>
+          <w:left w:val="single" w:sz="4" w:space="0" w:color="000000"/>
+          <w:bottom w:val="single" w:sz="4" w:space="0" w:color="000000"/>
+          <w:right w:val="single" w:sz="4" w:space="0" w:color="000000"/>
+          <w:insideH w:val="single" w:sz="4" w:space="0" w:color="000000"/>
+          <w:insideV w:val="single" w:sz="4" w:space="0" w:color="000000"/>
+        </w:tblBorders>
+      </w:tblPr>
+      <w:tblGrid>
+        <w:gridCol w:w="3346"/>
+        <w:gridCol w:w="3346"/>
+        <w:gridCol w:w="3346"/>
+      </w:tblGrid>
+      <w:tr>
+        <w:tc>
+          <w:tcPr>
+            <w:tcW w:type="dxa" w:w="2592"/>
+            <w:tcMar>
+              <w:top w:w="35" w:type="dxa"/>
+              <w:bottom w:w="35" w:type="dxa"/>
+              <w:left w:w="40" w:type="dxa"/>
+              <w:right w:w="40" w:type="dxa"/>
+            </w:tcMar>
+          </w:tcPr>
+          <w:p>
+            <w:pPr>
+              <w:spacing w:after="0"/>
+              <w:jc w:val="center"/>
+            </w:pPr>
+            <w:r>
+              <w:rPr>
+                <w:b/>
+                <w:sz w:val="17"/>
+              </w:rPr>
+              <w:t>Stock at site</w:t>
+            </w:r>
+          </w:p>
+        </w:tc>
+        <w:tc>
+          <w:tcPr>
+            <w:tcW w:type="dxa" w:w="2592"/>
+            <w:tcMar>
+              <w:top w:w="35" w:type="dxa"/>
+              <w:bottom w:w="35" w:type="dxa"/>
+              <w:left w:w="40" w:type="dxa"/>
+              <w:right w:w="40" w:type="dxa"/>
+            </w:tcMar>
+          </w:tcPr>
+          <w:p>
+            <w:pPr>
+              <w:spacing w:after="0"/>
+              <w:jc w:val="center"/>
+            </w:pPr>
+            <w:r>
+              <w:rPr>
+                <w:b/>
+                <w:sz w:val="17"/>
+              </w:rPr>
+              <w:t>Pending supply</w:t>
+            </w:r>
+          </w:p>
+        </w:tc>
+        <w:tc>
+          <w:tcPr>
+            <w:tcW w:type="dxa" w:w="3168"/>
+            <w:tcMar>
+              <w:top w:w="35" w:type="dxa"/>
+              <w:bottom w:w="35" w:type="dxa"/>
+              <w:left w:w="40" w:type="dxa"/>
+              <w:right w:w="40" w:type="dxa"/>
+            </w:tcMar>
+          </w:tcPr>
+          <w:p>
+            <w:pPr>
+              <w:spacing w:after="0"/>
+              <w:jc w:val="center"/>
+            </w:pPr>
+            <w:r>
+              <w:rPr>
+                <w:b/>
+                <w:sz w:val="17"/>
+              </w:rPr>
+              <w:t>Stock &amp; pending supplies</w:t>
             </w:r>
           </w:p>
         </w:tc>
@@ -918,42 +1645,412 @@
       <w:tr>
         <w:tc>
           <w:tcPr>
-            <w:tcW w:type="dxa" w:w="3744"/>
+            <w:tcW w:type="dxa" w:w="2592"/>
             <w:tcMar>
-              <w:top w:w="120" w:type="dxa"/>
-              <w:bottom w:w="120" w:type="dxa"/>
-              <w:left w:w="180" w:type="dxa"/>
-              <w:right w:w="180" w:type="dxa"/>
+              <w:top w:w="30" w:type="dxa"/>
+              <w:bottom w:w="30" w:type="dxa"/>
+              <w:left w:w="40" w:type="dxa"/>
+              <w:right w:w="40" w:type="dxa"/>
             </w:tcMar>
           </w:tcPr>
           <w:p>
             <w:pPr>
-              <w:spacing w:before="40" w:after="40"/>
+              <w:spacing w:after="0"/>
+              <w:jc w:val="center"/>
             </w:pPr>
             <w:r>
               <w:rPr>
-                <w:b/>
+                <w:sz w:val="17"/>
               </w:rPr>
-              <w:t>Indent approved date</w:t>
+              <w:t>2494 MT</w:t>
             </w:r>
           </w:p>
         </w:tc>
         <w:tc>
           <w:tcPr>
-            <w:tcW w:type="dxa" w:w="6624"/>
+            <w:tcW w:type="dxa" w:w="2592"/>
             <w:tcMar>
-              <w:top w:w="120" w:type="dxa"/>
-              <w:bottom w:w="120" w:type="dxa"/>
-              <w:left w:w="180" w:type="dxa"/>
-              <w:right w:w="180" w:type="dxa"/>
+              <w:top w:w="30" w:type="dxa"/>
+              <w:bottom w:w="30" w:type="dxa"/>
+              <w:left w:w="40" w:type="dxa"/>
+              <w:right w:w="40" w:type="dxa"/>
             </w:tcMar>
           </w:tcPr>
           <w:p>
             <w:pPr>
-              <w:spacing w:before="40" w:after="40"/>
+              <w:spacing w:after="0"/>
+              <w:jc w:val="center"/>
             </w:pPr>
             <w:r>
-              <w:t>10-05-2025</w:t>
+              <w:rPr>
+                <w:sz w:val="17"/>
+              </w:rPr>
+              <w:t>281 MT</w:t>
+            </w:r>
+          </w:p>
+        </w:tc>
+        <w:tc>
+          <w:tcPr>
+            <w:tcW w:type="dxa" w:w="3168"/>
+            <w:tcMar>
+              <w:top w:w="30" w:type="dxa"/>
+              <w:bottom w:w="30" w:type="dxa"/>
+              <w:left w:w="40" w:type="dxa"/>
+              <w:right w:w="40" w:type="dxa"/>
+            </w:tcMar>
+          </w:tcPr>
+          <w:p>
+            <w:pPr>
+              <w:spacing w:after="0"/>
+              <w:jc w:val="center"/>
+            </w:pPr>
+            <w:r>
+              <w:rPr>
+                <w:sz w:val="17"/>
+              </w:rPr>
+              <w:t>2775 MT</w:t>
+            </w:r>
+          </w:p>
+        </w:tc>
+      </w:tr>
+    </w:tbl>
+    <w:p>
+      <w:pPr>
+        <w:spacing w:before="80" w:after="0"/>
+      </w:pPr>
+      <w:r>
+        <w:rPr>
+          <w:sz w:val="18"/>
+        </w:rPr>
+        <w:t>4. SMS Operation vide email dated:15/04/2025 (copy enclosed) recommended to conduct price discovery for 4000 MT towards first phase of price discovery through EPS. Since, the price discovery is on monthly basis for 4000 MT, the eligibility criteria &amp; EMD are fixed based on the monthly price discovery quantity of 4,000 MT.</w:t>
+      </w:r>
+    </w:p>
+    <w:p>
+      <w:r>
+        <w:br w:type="page"/>
+      </w:r>
+    </w:p>
+    <w:p>
+      <w:pPr>
+        <w:spacing w:before="0" w:after="60"/>
+      </w:pPr>
+      <w:r>
+        <w:rPr>
+          <w:sz w:val="18"/>
+        </w:rPr>
+        <w:t>5. As per the clause no.8.1 of PCP-24, EMD shall be taken in all procurement cases of Open Tenders with indent value Rs.2 Crores &amp; above. Accordingly, applicable EMD amount of Rs.10,00,000/- will be taken from the participating bidders. However, Micro &amp; Small Enterprises (MSEs) / PSUs / Government Undertakings and Co-operative Societies / Start-ups as recognised by Department for Promotion of Industry and Internal Trade (DPIIT) will be exempted from submission of EMD as per extant Government policy.</w:t>
+      </w:r>
+    </w:p>
+    <w:p>
+      <w:pPr>
+        <w:spacing w:before="60" w:after="60"/>
+      </w:pPr>
+      <w:r>
+        <w:rPr>
+          <w:sz w:val="18"/>
+        </w:rPr>
+        <w:t>6. As per the extant guidelines of Government of India (GOI), purchase preference is applicable for MSE's as per PPP MSE's (Public Procurement Policy for MSE's) and for the Class I local suppliers as per PPP-MII policy (Public Procurement Policy - Make In India).</w:t>
+      </w:r>
+    </w:p>
+    <w:p>
+      <w:pPr>
+        <w:spacing w:before="60" w:after="40"/>
+      </w:pPr>
+      <w:r>
+        <w:rPr>
+          <w:sz w:val="18"/>
+        </w:rPr>
+        <w:t>7. In view of the above, the following are proposed</w:t>
+      </w:r>
+    </w:p>
+    <w:p>
+      <w:pPr>
+        <w:spacing w:before="20" w:after="20"/>
+        <w:ind w:left="432"/>
+      </w:pPr>
+      <w:r>
+        <w:rPr>
+          <w:sz w:val="17"/>
+        </w:rPr>
+        <w:t>i. To issue an Open Tender enquiry (Two Stage) through EPS;</w:t>
+      </w:r>
+    </w:p>
+    <w:p>
+      <w:pPr>
+        <w:spacing w:before="20" w:after="20"/>
+        <w:ind w:left="432"/>
+      </w:pPr>
+      <w:r>
+        <w:rPr>
+          <w:sz w:val="17"/>
+        </w:rPr>
+        <w:t>ii. To collect applicable EMD amount of Rs.10,00,000/- as per clause no.5 above;</w:t>
+      </w:r>
+    </w:p>
+    <w:p>
+      <w:pPr>
+        <w:spacing w:before="20" w:after="20"/>
+        <w:ind w:left="432"/>
+      </w:pPr>
+      <w:r>
+        <w:rPr>
+          <w:sz w:val="17"/>
+        </w:rPr>
+        <w:t>iii. To reduce the procurement lead time, the tender opening date will be kept as 10 days from the date of issue of tender;</w:t>
+      </w:r>
+    </w:p>
+    <w:p>
+      <w:pPr>
+        <w:spacing w:before="20" w:after="20"/>
+        <w:ind w:left="432"/>
+      </w:pPr>
+      <w:r>
+        <w:rPr>
+          <w:sz w:val="17"/>
+        </w:rPr>
+        <w:t>iv. LPP will be considered as estimate for subsequent RA's;</w:t>
+      </w:r>
+    </w:p>
+    <w:p>
+      <w:pPr>
+        <w:spacing w:before="20" w:after="20"/>
+        <w:ind w:left="432"/>
+      </w:pPr>
+      <w:r>
+        <w:rPr>
+          <w:sz w:val="17"/>
+        </w:rPr>
+        <w:t>v. Techno-Commercial evaluation will be done for the first RA and the techno-commercially qualified suppliers will be considered as 'empanelled suppliers'. The offers of such techno-commercially qualified suppliers will be accepted for price discoveries, during the period of validity specified in the indent;</w:t>
+      </w:r>
+    </w:p>
+    <w:p>
+      <w:pPr>
+        <w:spacing w:before="20" w:after="20"/>
+        <w:ind w:left="432"/>
+      </w:pPr>
+      <w:r>
+        <w:rPr>
+          <w:sz w:val="17"/>
+        </w:rPr>
+        <w:t>vi. Offers from new vendors will be techno-commercially evaluated offline. Upon successful techno-commercial evaluation, the new parties will be allowed to participate in the RA's along with the existing empanelled parties;</w:t>
+      </w:r>
+    </w:p>
+    <w:p>
+      <w:pPr>
+        <w:spacing w:before="20" w:after="20"/>
+        <w:ind w:left="432"/>
+      </w:pPr>
+      <w:r>
+        <w:rPr>
+          <w:sz w:val="17"/>
+        </w:rPr>
+        <w:t>vii. In case of receipt of less than 'x+2' offers, the due date for tender submission will be extended suitably;</w:t>
+      </w:r>
+    </w:p>
+    <w:p>
+      <w:pPr>
+        <w:spacing w:before="20" w:after="20"/>
+        <w:ind w:left="432"/>
+      </w:pPr>
+      <w:r>
+        <w:rPr>
+          <w:sz w:val="17"/>
+        </w:rPr>
+        <w:t>viii. Payment term will be "100% payment within 15 days from the date of acceptance supported by GARN/SRV and 3rd party certificate"</w:t>
+      </w:r>
+    </w:p>
+    <w:p>
+      <w:pPr>
+        <w:spacing w:before="20" w:after="20"/>
+        <w:ind w:left="432"/>
+      </w:pPr>
+      <w:r>
+        <w:rPr>
+          <w:sz w:val="17"/>
+        </w:rPr>
+        <w:t>ix. The successful tenderer shall submit 3% of total order value as Security Deposit (SD);</w:t>
+      </w:r>
+    </w:p>
+    <w:p>
+      <w:pPr>
+        <w:spacing w:before="160" w:after="40"/>
+      </w:pPr>
+      <w:r>
+        <w:rPr>
+          <w:b/>
+          <w:sz w:val="20"/>
+        </w:rPr>
+        <w:t>Approval Sought for</w:t>
+      </w:r>
+    </w:p>
+    <w:p>
+      <w:pPr>
+        <w:spacing w:after="120"/>
+      </w:pPr>
+      <w:r>
+        <w:rPr>
+          <w:sz w:val="18"/>
+        </w:rPr>
+        <w:t>Approval of Chief Executive is sought for issue of Open Tender Enquiry as proposed above.</w:t>
+      </w:r>
+    </w:p>
+    <w:p>
+      <w:pPr>
+        <w:spacing w:before="80" w:after="40"/>
+      </w:pPr>
+      <w:r>
+        <w:rPr>
+          <w:b/>
+          <w:sz w:val="20"/>
+        </w:rPr>
+        <w:t>DOP / Manual / Circular Ref &amp; Approver</w:t>
+      </w:r>
+    </w:p>
+    <w:p>
+      <w:pPr>
+        <w:spacing w:after="40"/>
+      </w:pPr>
+      <w:r>
+        <w:rPr>
+          <w:sz w:val="18"/>
+        </w:rPr>
+        <w:t>As per the DOP (Clause 1 of Page 24), issue of Open Tender enquiry for value above Rs.50 lakhs requires the approval of Chief Executive.</w:t>
+      </w:r>
+    </w:p>
+    <w:p>
+      <w:pPr>
+        <w:spacing w:after="160"/>
+      </w:pPr>
+      <w:r>
+        <w:rPr>
+          <w:sz w:val="18"/>
+        </w:rPr>
+        <w:t>SM (MM-P)/GM (MM-P) / GM I/c (MM) / CGM (Maint, Steel &amp; Projects) / CGM I/c (W)/CGM (F &amp;A) / ED</w:t>
+      </w:r>
+    </w:p>
+    <w:p>
+      <w:pPr>
+        <w:spacing w:before="80" w:after="60"/>
+      </w:pPr>
+      <w:r>
+        <w:rPr>
+          <w:b/>
+          <w:sz w:val="20"/>
+        </w:rPr>
+        <w:t>Notings : (SSP/SLM/MM PURCHASE/GEN/2025/214)</w:t>
+      </w:r>
+    </w:p>
+    <w:tbl>
+      <w:tblPr>
+        <w:tblW w:type="auto" w:w="0"/>
+        <w:jc w:val="center"/>
+        <w:tblLayout w:type="fixed"/>
+        <w:tblLook w:firstColumn="1" w:firstRow="1" w:lastColumn="0" w:lastRow="0" w:noHBand="0" w:noVBand="1" w:val="04A0"/>
+        <w:tblBorders>
+          <w:top w:val="single" w:sz="4" w:space="0" w:color="000000"/>
+          <w:left w:val="single" w:sz="4" w:space="0" w:color="000000"/>
+          <w:bottom w:val="single" w:sz="4" w:space="0" w:color="000000"/>
+          <w:right w:val="single" w:sz="4" w:space="0" w:color="000000"/>
+          <w:insideH w:val="single" w:sz="4" w:space="0" w:color="000000"/>
+          <w:insideV w:val="single" w:sz="4" w:space="0" w:color="000000"/>
+        </w:tblBorders>
+      </w:tblPr>
+      <w:tblGrid>
+        <w:gridCol w:w="2509"/>
+        <w:gridCol w:w="2509"/>
+        <w:gridCol w:w="2509"/>
+        <w:gridCol w:w="2509"/>
+      </w:tblGrid>
+      <w:tr>
+        <w:tc>
+          <w:tcPr>
+            <w:tcW w:type="dxa" w:w="864"/>
+            <w:tcMar>
+              <w:top w:w="35" w:type="dxa"/>
+              <w:bottom w:w="35" w:type="dxa"/>
+              <w:left w:w="40" w:type="dxa"/>
+              <w:right w:w="40" w:type="dxa"/>
+            </w:tcMar>
+          </w:tcPr>
+          <w:p>
+            <w:pPr>
+              <w:spacing w:after="0"/>
+            </w:pPr>
+            <w:r>
+              <w:rPr>
+                <w:b/>
+                <w:sz w:val="17"/>
+              </w:rPr>
+              <w:t>SNo</w:t>
+            </w:r>
+          </w:p>
+        </w:tc>
+        <w:tc>
+          <w:tcPr>
+            <w:tcW w:type="dxa" w:w="3600"/>
+            <w:tcMar>
+              <w:top w:w="35" w:type="dxa"/>
+              <w:bottom w:w="35" w:type="dxa"/>
+              <w:left w:w="40" w:type="dxa"/>
+              <w:right w:w="40" w:type="dxa"/>
+            </w:tcMar>
+          </w:tcPr>
+          <w:p>
+            <w:pPr>
+              <w:spacing w:after="0"/>
+            </w:pPr>
+            <w:r>
+              <w:rPr>
+                <w:b/>
+                <w:sz w:val="17"/>
+              </w:rPr>
+              <w:t>Action By</w:t>
+            </w:r>
+          </w:p>
+        </w:tc>
+        <w:tc>
+          <w:tcPr>
+            <w:tcW w:type="dxa" w:w="2016"/>
+            <w:tcMar>
+              <w:top w:w="35" w:type="dxa"/>
+              <w:bottom w:w="35" w:type="dxa"/>
+              <w:left w:w="40" w:type="dxa"/>
+              <w:right w:w="40" w:type="dxa"/>
+            </w:tcMar>
+          </w:tcPr>
+          <w:p>
+            <w:pPr>
+              <w:spacing w:after="0"/>
+            </w:pPr>
+            <w:r>
+              <w:rPr>
+                <w:b/>
+                <w:sz w:val="17"/>
+              </w:rPr>
+              <w:t>Action</w:t>
+            </w:r>
+          </w:p>
+        </w:tc>
+        <w:tc>
+          <w:tcPr>
+            <w:tcW w:type="dxa" w:w="3557"/>
+            <w:tcMar>
+              <w:top w:w="35" w:type="dxa"/>
+              <w:bottom w:w="35" w:type="dxa"/>
+              <w:left w:w="40" w:type="dxa"/>
+              <w:right w:w="40" w:type="dxa"/>
+            </w:tcMar>
+          </w:tcPr>
+          <w:p>
+            <w:pPr>
+              <w:spacing w:after="0"/>
+            </w:pPr>
+            <w:r>
+              <w:rPr>
+                <w:b/>
+                <w:sz w:val="17"/>
+              </w:rPr>
+              <w:t>Comments</w:t>
             </w:r>
           </w:p>
         </w:tc>
@@ -961,42 +2058,222 @@
       <w:tr>
         <w:tc>
           <w:tcPr>
-            <w:tcW w:type="dxa" w:w="3744"/>
+            <w:tcW w:type="dxa" w:w="864"/>
             <w:tcMar>
-              <w:top w:w="120" w:type="dxa"/>
-              <w:bottom w:w="120" w:type="dxa"/>
-              <w:left w:w="180" w:type="dxa"/>
-              <w:right w:w="180" w:type="dxa"/>
+              <w:top w:w="35" w:type="dxa"/>
+              <w:bottom w:w="35" w:type="dxa"/>
+              <w:left w:w="40" w:type="dxa"/>
+              <w:right w:w="40" w:type="dxa"/>
             </w:tcMar>
           </w:tcPr>
           <w:p>
             <w:pPr>
-              <w:spacing w:before="40" w:after="40"/>
+              <w:spacing w:after="0"/>
             </w:pPr>
             <w:r>
               <w:rPr>
-                <w:b/>
+                <w:sz w:val="17"/>
               </w:rPr>
-              <w:t>Mode of Tender</w:t>
+              <w:t>1</w:t>
             </w:r>
           </w:p>
         </w:tc>
         <w:tc>
           <w:tcPr>
-            <w:tcW w:type="dxa" w:w="6624"/>
+            <w:tcW w:type="dxa" w:w="3600"/>
             <w:tcMar>
-              <w:top w:w="120" w:type="dxa"/>
-              <w:bottom w:w="120" w:type="dxa"/>
-              <w:left w:w="180" w:type="dxa"/>
-              <w:right w:w="180" w:type="dxa"/>
+              <w:top w:w="35" w:type="dxa"/>
+              <w:bottom w:w="35" w:type="dxa"/>
+              <w:left w:w="40" w:type="dxa"/>
+              <w:right w:w="40" w:type="dxa"/>
             </w:tcMar>
           </w:tcPr>
           <w:p>
             <w:pPr>
-              <w:spacing w:before="40" w:after="40"/>
+              <w:spacing w:after="0"/>
             </w:pPr>
             <w:r>
-              <w:t>OTE THROUGH EPS (M-JUNCTION)</w:t>
+              <w:rPr>
+                <w:sz w:val="17"/>
+              </w:rPr>
+              <w:t>PATRI PRATHIMA , PNo:</w:t>
+              <w:br/>
+              <w:t>C003320</w:t>
+              <w:br/>
+              <w:t>E7, GENERAL MANAGER</w:t>
+              <w:br/>
+              <w:t>(PURCHASE)</w:t>
+            </w:r>
+          </w:p>
+        </w:tc>
+        <w:tc>
+          <w:tcPr>
+            <w:tcW w:type="dxa" w:w="2016"/>
+            <w:tcMar>
+              <w:top w:w="35" w:type="dxa"/>
+              <w:bottom w:w="35" w:type="dxa"/>
+              <w:left w:w="40" w:type="dxa"/>
+              <w:right w:w="40" w:type="dxa"/>
+            </w:tcMar>
+          </w:tcPr>
+          <w:p>
+            <w:pPr>
+              <w:spacing w:after="0"/>
+            </w:pPr>
+            <w:r>
+              <w:rPr>
+                <w:sz w:val="17"/>
+              </w:rPr>
+              <w:t>Forward</w:t>
+              <w:br/>
+              <w:t>On 05-05-</w:t>
+              <w:br/>
+              <w:t>2025</w:t>
+            </w:r>
+          </w:p>
+        </w:tc>
+        <w:tc>
+          <w:tcPr>
+            <w:tcW w:type="dxa" w:w="3557"/>
+            <w:tcMar>
+              <w:top w:w="35" w:type="dxa"/>
+              <w:bottom w:w="35" w:type="dxa"/>
+              <w:left w:w="40" w:type="dxa"/>
+              <w:right w:w="40" w:type="dxa"/>
+            </w:tcMar>
+          </w:tcPr>
+          <w:p>
+            <w:pPr>
+              <w:spacing w:after="0"/>
+            </w:pPr>
+            <w:r>
+              <w:rPr>
+                <w:sz w:val="17"/>
+              </w:rPr>
+              <w:t>Forwarded.</w:t>
+            </w:r>
+          </w:p>
+        </w:tc>
+      </w:tr>
+    </w:tbl>
+    <w:p>
+      <w:r>
+        <w:br w:type="page"/>
+      </w:r>
+    </w:p>
+    <w:tbl>
+      <w:tblPr>
+        <w:tblW w:type="auto" w:w="0"/>
+        <w:jc w:val="center"/>
+        <w:tblLayout w:type="fixed"/>
+        <w:tblLook w:firstColumn="1" w:firstRow="1" w:lastColumn="0" w:lastRow="0" w:noHBand="0" w:noVBand="1" w:val="04A0"/>
+        <w:tblBorders>
+          <w:top w:val="single" w:sz="4" w:space="0" w:color="000000"/>
+          <w:left w:val="single" w:sz="4" w:space="0" w:color="000000"/>
+          <w:bottom w:val="single" w:sz="4" w:space="0" w:color="000000"/>
+          <w:right w:val="single" w:sz="4" w:space="0" w:color="000000"/>
+          <w:insideH w:val="single" w:sz="4" w:space="0" w:color="000000"/>
+          <w:insideV w:val="single" w:sz="4" w:space="0" w:color="000000"/>
+        </w:tblBorders>
+      </w:tblPr>
+      <w:tblGrid>
+        <w:gridCol w:w="2509"/>
+        <w:gridCol w:w="2509"/>
+        <w:gridCol w:w="2509"/>
+        <w:gridCol w:w="2509"/>
+      </w:tblGrid>
+      <w:tr>
+        <w:tc>
+          <w:tcPr>
+            <w:tcW w:type="dxa" w:w="864"/>
+            <w:tcMar>
+              <w:top w:w="35" w:type="dxa"/>
+              <w:bottom w:w="35" w:type="dxa"/>
+              <w:left w:w="40" w:type="dxa"/>
+              <w:right w:w="40" w:type="dxa"/>
+            </w:tcMar>
+          </w:tcPr>
+          <w:p>
+            <w:pPr>
+              <w:spacing w:after="0"/>
+            </w:pPr>
+            <w:r>
+              <w:rPr>
+                <w:sz w:val="17"/>
+              </w:rPr>
+              <w:t>2</w:t>
+            </w:r>
+          </w:p>
+        </w:tc>
+        <w:tc>
+          <w:tcPr>
+            <w:tcW w:type="dxa" w:w="3600"/>
+            <w:tcMar>
+              <w:top w:w="35" w:type="dxa"/>
+              <w:bottom w:w="35" w:type="dxa"/>
+              <w:left w:w="40" w:type="dxa"/>
+              <w:right w:w="40" w:type="dxa"/>
+            </w:tcMar>
+          </w:tcPr>
+          <w:p>
+            <w:pPr>
+              <w:spacing w:after="0"/>
+            </w:pPr>
+            <w:r>
+              <w:rPr>
+                <w:sz w:val="17"/>
+              </w:rPr>
+              <w:t>MANOJ M , PNo: L000108</w:t>
+              <w:br/>
+              <w:t>E7, GM I/c (MM)</w:t>
+            </w:r>
+          </w:p>
+        </w:tc>
+        <w:tc>
+          <w:tcPr>
+            <w:tcW w:type="dxa" w:w="2016"/>
+            <w:tcMar>
+              <w:top w:w="35" w:type="dxa"/>
+              <w:bottom w:w="35" w:type="dxa"/>
+              <w:left w:w="40" w:type="dxa"/>
+              <w:right w:w="40" w:type="dxa"/>
+            </w:tcMar>
+          </w:tcPr>
+          <w:p>
+            <w:pPr>
+              <w:spacing w:after="0"/>
+            </w:pPr>
+            <w:r>
+              <w:rPr>
+                <w:sz w:val="17"/>
+              </w:rPr>
+              <w:t>Forward</w:t>
+              <w:br/>
+              <w:t>On 06-05-</w:t>
+              <w:br/>
+              <w:t>2025</w:t>
+            </w:r>
+          </w:p>
+        </w:tc>
+        <w:tc>
+          <w:tcPr>
+            <w:tcW w:type="dxa" w:w="3557"/>
+            <w:tcMar>
+              <w:top w:w="35" w:type="dxa"/>
+              <w:bottom w:w="35" w:type="dxa"/>
+              <w:left w:w="40" w:type="dxa"/>
+              <w:right w:w="40" w:type="dxa"/>
+            </w:tcMar>
+          </w:tcPr>
+          <w:p>
+            <w:pPr>
+              <w:spacing w:after="0"/>
+            </w:pPr>
+            <w:r>
+              <w:rPr>
+                <w:sz w:val="17"/>
+              </w:rPr>
+              <w:t>Forwarded</w:t>
             </w:r>
           </w:p>
         </w:tc>
@@ -1004,25 +2281,101 @@
       <w:tr>
         <w:tc>
           <w:tcPr>
-            <w:tcW w:type="dxa" w:w="6624"/>
-            <w:gridSpan w:val="2"/>
-            <w:shd w:fill="E2E8F0"/>
+            <w:tcW w:type="dxa" w:w="864"/>
             <w:tcMar>
-              <w:top w:w="120" w:type="dxa"/>
-              <w:bottom w:w="120" w:type="dxa"/>
-              <w:left w:w="180" w:type="dxa"/>
-              <w:right w:w="180" w:type="dxa"/>
+              <w:top w:w="35" w:type="dxa"/>
+              <w:bottom w:w="35" w:type="dxa"/>
+              <w:left w:w="40" w:type="dxa"/>
+              <w:right w:w="40" w:type="dxa"/>
             </w:tcMar>
           </w:tcPr>
           <w:p>
             <w:pPr>
-              <w:spacing w:before="60" w:after="60"/>
+              <w:spacing w:after="0"/>
             </w:pPr>
             <w:r>
               <w:rPr>
-                <w:b/>
+                <w:sz w:val="17"/>
               </w:rPr>
-              <w:t>Sanction Particulars:</w:t>
+              <w:t>3</w:t>
+            </w:r>
+          </w:p>
+        </w:tc>
+        <w:tc>
+          <w:tcPr>
+            <w:tcW w:type="dxa" w:w="3600"/>
+            <w:tcMar>
+              <w:top w:w="35" w:type="dxa"/>
+              <w:bottom w:w="35" w:type="dxa"/>
+              <w:left w:w="40" w:type="dxa"/>
+              <w:right w:w="40" w:type="dxa"/>
+            </w:tcMar>
+          </w:tcPr>
+          <w:p>
+            <w:pPr>
+              <w:spacing w:after="0"/>
+            </w:pPr>
+            <w:r>
+              <w:rPr>
+                <w:sz w:val="17"/>
+              </w:rPr>
+              <w:t>RAVI CHANDER DV , PNo:</w:t>
+              <w:br/>
+              <w:t>L000111</w:t>
+              <w:br/>
+              <w:t>E8, CGM(MAINTENANCE, STEEL</w:t>
+              <w:br/>
+              <w:t>&amp; PROJECTS)</w:t>
+            </w:r>
+          </w:p>
+        </w:tc>
+        <w:tc>
+          <w:tcPr>
+            <w:tcW w:type="dxa" w:w="2016"/>
+            <w:tcMar>
+              <w:top w:w="35" w:type="dxa"/>
+              <w:bottom w:w="35" w:type="dxa"/>
+              <w:left w:w="40" w:type="dxa"/>
+              <w:right w:w="40" w:type="dxa"/>
+            </w:tcMar>
+          </w:tcPr>
+          <w:p>
+            <w:pPr>
+              <w:spacing w:after="0"/>
+            </w:pPr>
+            <w:r>
+              <w:rPr>
+                <w:sz w:val="17"/>
+              </w:rPr>
+              <w:t>Forward</w:t>
+              <w:br/>
+              <w:t>On 06-05-</w:t>
+              <w:br/>
+              <w:t>2025</w:t>
+            </w:r>
+          </w:p>
+        </w:tc>
+        <w:tc>
+          <w:tcPr>
+            <w:tcW w:type="dxa" w:w="3557"/>
+            <w:tcMar>
+              <w:top w:w="35" w:type="dxa"/>
+              <w:bottom w:w="35" w:type="dxa"/>
+              <w:left w:w="40" w:type="dxa"/>
+              <w:right w:w="40" w:type="dxa"/>
+            </w:tcMar>
+          </w:tcPr>
+          <w:p>
+            <w:pPr>
+              <w:spacing w:after="0"/>
+            </w:pPr>
+            <w:r>
+              <w:rPr>
+                <w:sz w:val="17"/>
+              </w:rPr>
+              <w:t>Forwarded. Forwarded also on behalf of CGM I/c(W).</w:t>
+              <w:br/>
+              <w:t>Office order attached</w:t>
             </w:r>
           </w:p>
         </w:tc>
@@ -1030,47 +2383,97 @@
       <w:tr>
         <w:tc>
           <w:tcPr>
-            <w:tcW w:type="dxa" w:w="3744"/>
+            <w:tcW w:type="dxa" w:w="864"/>
             <w:tcMar>
-              <w:top w:w="120" w:type="dxa"/>
-              <w:bottom w:w="120" w:type="dxa"/>
-              <w:left w:w="180" w:type="dxa"/>
-              <w:right w:w="180" w:type="dxa"/>
+              <w:top w:w="35" w:type="dxa"/>
+              <w:bottom w:w="35" w:type="dxa"/>
+              <w:left w:w="40" w:type="dxa"/>
+              <w:right w:w="40" w:type="dxa"/>
             </w:tcMar>
-            <w:shd w:fill="EDF2F7"/>
           </w:tcPr>
           <w:p>
             <w:pPr>
-              <w:spacing w:before="40" w:after="40"/>
+              <w:spacing w:after="0"/>
             </w:pPr>
             <w:r>
               <w:rPr>
-                <w:b/>
+                <w:sz w:val="17"/>
               </w:rPr>
-              <w:t>Parameter</w:t>
+              <w:t>4</w:t>
             </w:r>
           </w:p>
         </w:tc>
         <w:tc>
           <w:tcPr>
-            <w:tcW w:type="dxa" w:w="6624"/>
+            <w:tcW w:type="dxa" w:w="3600"/>
             <w:tcMar>
-              <w:top w:w="120" w:type="dxa"/>
-              <w:bottom w:w="120" w:type="dxa"/>
-              <w:left w:w="180" w:type="dxa"/>
-              <w:right w:w="180" w:type="dxa"/>
+              <w:top w:w="35" w:type="dxa"/>
+              <w:bottom w:w="35" w:type="dxa"/>
+              <w:left w:w="40" w:type="dxa"/>
+              <w:right w:w="40" w:type="dxa"/>
             </w:tcMar>
-            <w:shd w:fill="EDF2F7"/>
           </w:tcPr>
           <w:p>
             <w:pPr>
-              <w:spacing w:before="40" w:after="40"/>
+              <w:spacing w:after="0"/>
             </w:pPr>
             <w:r>
               <w:rPr>
-                <w:b/>
+                <w:sz w:val="17"/>
               </w:rPr>
-              <w:t>Value</w:t>
+              <w:t>KISHOR JETHABHAI CHAUHAN</w:t>
+              <w:br/>
+              <w:t>, PNo: I000236</w:t>
+              <w:br/>
+              <w:t>E8, CGM (F&amp;A)</w:t>
+            </w:r>
+          </w:p>
+        </w:tc>
+        <w:tc>
+          <w:tcPr>
+            <w:tcW w:type="dxa" w:w="2016"/>
+            <w:tcMar>
+              <w:top w:w="35" w:type="dxa"/>
+              <w:bottom w:w="35" w:type="dxa"/>
+              <w:left w:w="40" w:type="dxa"/>
+              <w:right w:w="40" w:type="dxa"/>
+            </w:tcMar>
+          </w:tcPr>
+          <w:p>
+            <w:pPr>
+              <w:spacing w:after="0"/>
+            </w:pPr>
+            <w:r>
+              <w:rPr>
+                <w:sz w:val="17"/>
+              </w:rPr>
+              <w:t>Forward</w:t>
+              <w:br/>
+              <w:t>On 06-05-</w:t>
+              <w:br/>
+              <w:t>2025</w:t>
+            </w:r>
+          </w:p>
+        </w:tc>
+        <w:tc>
+          <w:tcPr>
+            <w:tcW w:type="dxa" w:w="3557"/>
+            <w:tcMar>
+              <w:top w:w="35" w:type="dxa"/>
+              <w:bottom w:w="35" w:type="dxa"/>
+              <w:left w:w="40" w:type="dxa"/>
+              <w:right w:w="40" w:type="dxa"/>
+            </w:tcMar>
+          </w:tcPr>
+          <w:p>
+            <w:pPr>
+              <w:spacing w:after="0"/>
+            </w:pPr>
+            <w:r>
+              <w:rPr>
+                <w:sz w:val="17"/>
+              </w:rPr>
+              <w:t>Pl. examine.</w:t>
             </w:r>
           </w:p>
         </w:tc>
@@ -1078,42 +2481,99 @@
       <w:tr>
         <w:tc>
           <w:tcPr>
-            <w:tcW w:type="dxa" w:w="3744"/>
+            <w:tcW w:type="dxa" w:w="864"/>
             <w:tcMar>
-              <w:top w:w="120" w:type="dxa"/>
-              <w:bottom w:w="120" w:type="dxa"/>
-              <w:left w:w="180" w:type="dxa"/>
-              <w:right w:w="180" w:type="dxa"/>
+              <w:top w:w="35" w:type="dxa"/>
+              <w:bottom w:w="35" w:type="dxa"/>
+              <w:left w:w="40" w:type="dxa"/>
+              <w:right w:w="40" w:type="dxa"/>
             </w:tcMar>
           </w:tcPr>
           <w:p>
             <w:pPr>
-              <w:spacing w:before="40" w:after="40"/>
+              <w:spacing w:after="0"/>
             </w:pPr>
             <w:r>
               <w:rPr>
-                <w:b/>
+                <w:sz w:val="17"/>
               </w:rPr>
-              <w:t>Name of the supplier</w:t>
+              <w:t>5</w:t>
             </w:r>
           </w:p>
         </w:tc>
         <w:tc>
           <w:tcPr>
-            <w:tcW w:type="dxa" w:w="6624"/>
+            <w:tcW w:type="dxa" w:w="3600"/>
             <w:tcMar>
-              <w:top w:w="120" w:type="dxa"/>
-              <w:bottom w:w="120" w:type="dxa"/>
-              <w:left w:w="180" w:type="dxa"/>
-              <w:right w:w="180" w:type="dxa"/>
+              <w:top w:w="35" w:type="dxa"/>
+              <w:bottom w:w="35" w:type="dxa"/>
+              <w:left w:w="40" w:type="dxa"/>
+              <w:right w:w="40" w:type="dxa"/>
             </w:tcMar>
           </w:tcPr>
           <w:p>
             <w:pPr>
-              <w:spacing w:before="40" w:after="40"/>
+              <w:spacing w:after="0"/>
             </w:pPr>
             <w:r>
-              <w:t>Maximum three parties as per tender terms (LPP placed on M/s KSJ Recyclers, M/s Shabro Metallic, M/s MTC Business)</w:t>
+              <w:rPr>
+                <w:sz w:val="17"/>
+              </w:rPr>
+              <w:t>VARADARAJAN N , PNo:</w:t>
+              <w:br/>
+              <w:t>L000171</w:t>
+              <w:br/>
+              <w:t>E8, CHIEF GENERAL MANAGER</w:t>
+              <w:br/>
+              <w:t>(F &amp; A)</w:t>
+            </w:r>
+          </w:p>
+        </w:tc>
+        <w:tc>
+          <w:tcPr>
+            <w:tcW w:type="dxa" w:w="2016"/>
+            <w:tcMar>
+              <w:top w:w="35" w:type="dxa"/>
+              <w:bottom w:w="35" w:type="dxa"/>
+              <w:left w:w="40" w:type="dxa"/>
+              <w:right w:w="40" w:type="dxa"/>
+            </w:tcMar>
+          </w:tcPr>
+          <w:p>
+            <w:pPr>
+              <w:spacing w:after="0"/>
+            </w:pPr>
+            <w:r>
+              <w:rPr>
+                <w:sz w:val="17"/>
+              </w:rPr>
+              <w:t>Forward</w:t>
+              <w:br/>
+              <w:t>On 06-05-</w:t>
+              <w:br/>
+              <w:t>2025</w:t>
+            </w:r>
+          </w:p>
+        </w:tc>
+        <w:tc>
+          <w:tcPr>
+            <w:tcW w:type="dxa" w:w="3557"/>
+            <w:tcMar>
+              <w:top w:w="35" w:type="dxa"/>
+              <w:bottom w:w="35" w:type="dxa"/>
+              <w:left w:w="40" w:type="dxa"/>
+              <w:right w:w="40" w:type="dxa"/>
+            </w:tcMar>
+          </w:tcPr>
+          <w:p>
+            <w:pPr>
+              <w:spacing w:after="0"/>
+            </w:pPr>
+            <w:r>
+              <w:rPr>
+                <w:sz w:val="17"/>
+              </w:rPr>
+              <w:t>The proposal is forwarded.</w:t>
             </w:r>
           </w:p>
         </w:tc>
@@ -1121,42 +2581,97 @@
       <w:tr>
         <w:tc>
           <w:tcPr>
-            <w:tcW w:type="dxa" w:w="3744"/>
+            <w:tcW w:type="dxa" w:w="864"/>
             <w:tcMar>
-              <w:top w:w="120" w:type="dxa"/>
-              <w:bottom w:w="120" w:type="dxa"/>
-              <w:left w:w="180" w:type="dxa"/>
-              <w:right w:w="180" w:type="dxa"/>
+              <w:top w:w="35" w:type="dxa"/>
+              <w:bottom w:w="35" w:type="dxa"/>
+              <w:left w:w="40" w:type="dxa"/>
+              <w:right w:w="40" w:type="dxa"/>
             </w:tcMar>
           </w:tcPr>
           <w:p>
             <w:pPr>
-              <w:spacing w:before="40" w:after="40"/>
+              <w:spacing w:after="0"/>
             </w:pPr>
             <w:r>
               <w:rPr>
-                <w:b/>
+                <w:sz w:val="17"/>
               </w:rPr>
-              <w:t>Order Value Incl. GST</w:t>
+              <w:t>6</w:t>
             </w:r>
           </w:p>
         </w:tc>
         <w:tc>
           <w:tcPr>
-            <w:tcW w:type="dxa" w:w="6624"/>
+            <w:tcW w:type="dxa" w:w="3600"/>
             <w:tcMar>
-              <w:top w:w="120" w:type="dxa"/>
-              <w:bottom w:w="120" w:type="dxa"/>
-              <w:left w:w="180" w:type="dxa"/>
-              <w:right w:w="180" w:type="dxa"/>
+              <w:top w:w="35" w:type="dxa"/>
+              <w:bottom w:w="35" w:type="dxa"/>
+              <w:left w:w="40" w:type="dxa"/>
+              <w:right w:w="40" w:type="dxa"/>
             </w:tcMar>
           </w:tcPr>
           <w:p>
             <w:pPr>
-              <w:spacing w:before="40" w:after="40"/>
+              <w:spacing w:after="0"/>
             </w:pPr>
             <w:r>
-              <w:t>₹ 1,32,27,32,800/-</w:t>
+              <w:rPr>
+                <w:sz w:val="17"/>
+              </w:rPr>
+              <w:t>KISHOR JETHABHAI CHAUHAN</w:t>
+              <w:br/>
+              <w:t>, PNo: I000236</w:t>
+              <w:br/>
+              <w:t>E8, CGM (F&amp;A)</w:t>
+            </w:r>
+          </w:p>
+        </w:tc>
+        <w:tc>
+          <w:tcPr>
+            <w:tcW w:type="dxa" w:w="2016"/>
+            <w:tcMar>
+              <w:top w:w="35" w:type="dxa"/>
+              <w:bottom w:w="35" w:type="dxa"/>
+              <w:left w:w="40" w:type="dxa"/>
+              <w:right w:w="40" w:type="dxa"/>
+            </w:tcMar>
+          </w:tcPr>
+          <w:p>
+            <w:pPr>
+              <w:spacing w:after="0"/>
+            </w:pPr>
+            <w:r>
+              <w:rPr>
+                <w:sz w:val="17"/>
+              </w:rPr>
+              <w:t>Forward</w:t>
+              <w:br/>
+              <w:t>On 06-05-</w:t>
+              <w:br/>
+              <w:t>2025</w:t>
+            </w:r>
+          </w:p>
+        </w:tc>
+        <w:tc>
+          <w:tcPr>
+            <w:tcW w:type="dxa" w:w="3557"/>
+            <w:tcMar>
+              <w:top w:w="35" w:type="dxa"/>
+              <w:bottom w:w="35" w:type="dxa"/>
+              <w:left w:w="40" w:type="dxa"/>
+              <w:right w:w="40" w:type="dxa"/>
+            </w:tcMar>
+          </w:tcPr>
+          <w:p>
+            <w:pPr>
+              <w:spacing w:after="0"/>
+            </w:pPr>
+            <w:r>
+              <w:rPr>
+                <w:sz w:val="17"/>
+              </w:rPr>
+              <w:t>Forwarded.</w:t>
             </w:r>
           </w:p>
         </w:tc>
@@ -1164,42 +2679,169 @@
       <w:tr>
         <w:tc>
           <w:tcPr>
-            <w:tcW w:type="dxa" w:w="3744"/>
+            <w:tcW w:type="dxa" w:w="864"/>
             <w:tcMar>
-              <w:top w:w="120" w:type="dxa"/>
-              <w:bottom w:w="120" w:type="dxa"/>
-              <w:left w:w="180" w:type="dxa"/>
-              <w:right w:w="180" w:type="dxa"/>
+              <w:top w:w="35" w:type="dxa"/>
+              <w:bottom w:w="35" w:type="dxa"/>
+              <w:left w:w="40" w:type="dxa"/>
+              <w:right w:w="40" w:type="dxa"/>
             </w:tcMar>
           </w:tcPr>
           <w:p>
             <w:pPr>
-              <w:spacing w:before="40" w:after="40"/>
+              <w:spacing w:after="0"/>
             </w:pPr>
             <w:r>
               <w:rPr>
-                <w:b/>
+                <w:sz w:val="17"/>
               </w:rPr>
-              <w:t>Deviation wrt estimate</w:t>
+              <w:t>7</w:t>
             </w:r>
           </w:p>
         </w:tc>
         <w:tc>
           <w:tcPr>
-            <w:tcW w:type="dxa" w:w="6624"/>
+            <w:tcW w:type="dxa" w:w="3600"/>
             <w:tcMar>
-              <w:top w:w="120" w:type="dxa"/>
-              <w:bottom w:w="120" w:type="dxa"/>
-              <w:left w:w="180" w:type="dxa"/>
-              <w:right w:w="180" w:type="dxa"/>
+              <w:top w:w="35" w:type="dxa"/>
+              <w:bottom w:w="35" w:type="dxa"/>
+              <w:left w:w="40" w:type="dxa"/>
+              <w:right w:w="40" w:type="dxa"/>
             </w:tcMar>
           </w:tcPr>
           <w:p>
             <w:pPr>
-              <w:spacing w:before="40" w:after="40"/>
+              <w:spacing w:after="0"/>
             </w:pPr>
             <w:r>
-              <w:t>0.00 (At par with estimate)</w:t>
+              <w:rPr>
+                <w:sz w:val="17"/>
+              </w:rPr>
+              <w:t>PRABIR KUMAR SARKAR , PNo:</w:t>
+              <w:br/>
+              <w:t>B001402</w:t>
+              <w:br/>
+              <w:t>E9, EXECUTIVE DIRECTOR</w:t>
+            </w:r>
+          </w:p>
+        </w:tc>
+        <w:tc>
+          <w:tcPr>
+            <w:tcW w:type="dxa" w:w="2016"/>
+            <w:tcMar>
+              <w:top w:w="35" w:type="dxa"/>
+              <w:bottom w:w="35" w:type="dxa"/>
+              <w:left w:w="40" w:type="dxa"/>
+              <w:right w:w="40" w:type="dxa"/>
+            </w:tcMar>
+          </w:tcPr>
+          <w:p>
+            <w:pPr>
+              <w:spacing w:after="0"/>
+            </w:pPr>
+            <w:r>
+              <w:rPr>
+                <w:sz w:val="17"/>
+              </w:rPr>
+              <w:t>Approved</w:t>
+              <w:br/>
+              <w:t>On 08-05-</w:t>
+              <w:br/>
+              <w:t>2025</w:t>
+            </w:r>
+          </w:p>
+        </w:tc>
+        <w:tc>
+          <w:tcPr>
+            <w:tcW w:type="dxa" w:w="3557"/>
+            <w:tcMar>
+              <w:top w:w="35" w:type="dxa"/>
+              <w:bottom w:w="35" w:type="dxa"/>
+              <w:left w:w="40" w:type="dxa"/>
+              <w:right w:w="40" w:type="dxa"/>
+            </w:tcMar>
+          </w:tcPr>
+          <w:p>
+            <w:pPr>
+              <w:spacing w:after="0"/>
+            </w:pPr>
+            <w:r>
+              <w:rPr>
+                <w:sz w:val="17"/>
+              </w:rPr>
+              <w:t>Approved.</w:t>
+            </w:r>
+          </w:p>
+        </w:tc>
+      </w:tr>
+    </w:tbl>
+    <w:p>
+      <w:pPr>
+        <w:spacing w:after="80"/>
+      </w:pPr>
+    </w:p>
+    <w:tbl>
+      <w:tblPr>
+        <w:tblW w:type="auto" w:w="0"/>
+        <w:jc w:val="center"/>
+        <w:tblLayout w:type="fixed"/>
+        <w:tblLook w:firstColumn="1" w:firstRow="1" w:lastColumn="0" w:lastRow="0" w:noHBand="0" w:noVBand="1" w:val="04A0"/>
+        <w:tblBorders>
+          <w:top w:val="single" w:sz="4" w:space="0" w:color="000000"/>
+          <w:left w:val="single" w:sz="4" w:space="0" w:color="000000"/>
+          <w:bottom w:val="single" w:sz="4" w:space="0" w:color="000000"/>
+          <w:right w:val="single" w:sz="4" w:space="0" w:color="000000"/>
+          <w:insideH w:val="single" w:sz="4" w:space="0" w:color="000000"/>
+          <w:insideV w:val="single" w:sz="4" w:space="0" w:color="000000"/>
+        </w:tblBorders>
+      </w:tblPr>
+      <w:tblGrid>
+        <w:gridCol w:w="5018"/>
+        <w:gridCol w:w="5018"/>
+      </w:tblGrid>
+      <w:tr>
+        <w:tc>
+          <w:tcPr>
+            <w:tcW w:type="dxa" w:w="3600"/>
+            <w:tcMar>
+              <w:top w:w="35" w:type="dxa"/>
+              <w:bottom w:w="35" w:type="dxa"/>
+              <w:left w:w="60" w:type="dxa"/>
+              <w:right w:w="60" w:type="dxa"/>
+            </w:tcMar>
+          </w:tcPr>
+          <w:p>
+            <w:pPr>
+              <w:spacing w:after="0"/>
+            </w:pPr>
+            <w:r>
+              <w:rPr>
+                <w:b/>
+                <w:sz w:val="18"/>
+              </w:rPr>
+              <w:t>No. of attachments</w:t>
+            </w:r>
+          </w:p>
+        </w:tc>
+        <w:tc>
+          <w:tcPr>
+            <w:tcW w:type="dxa" w:w="6437"/>
+            <w:tcMar>
+              <w:top w:w="35" w:type="dxa"/>
+              <w:bottom w:w="35" w:type="dxa"/>
+              <w:left w:w="60" w:type="dxa"/>
+              <w:right w:w="60" w:type="dxa"/>
+            </w:tcMar>
+          </w:tcPr>
+          <w:p>
+            <w:pPr>
+              <w:spacing w:after="0"/>
+            </w:pPr>
+            <w:r>
+              <w:rPr>
+                <w:sz w:val="18"/>
+              </w:rPr>
+              <w:t>6</w:t>
             </w:r>
           </w:p>
         </w:tc>
@@ -1207,25 +2849,46 @@
       <w:tr>
         <w:tc>
           <w:tcPr>
-            <w:tcW w:type="dxa" w:w="6624"/>
-            <w:gridSpan w:val="2"/>
-            <w:shd w:fill="E2E8F0"/>
+            <w:tcW w:type="dxa" w:w="3600"/>
             <w:tcMar>
-              <w:top w:w="120" w:type="dxa"/>
-              <w:bottom w:w="120" w:type="dxa"/>
-              <w:left w:w="180" w:type="dxa"/>
-              <w:right w:w="180" w:type="dxa"/>
+              <w:top w:w="35" w:type="dxa"/>
+              <w:bottom w:w="35" w:type="dxa"/>
+              <w:left w:w="60" w:type="dxa"/>
+              <w:right w:w="60" w:type="dxa"/>
             </w:tcMar>
           </w:tcPr>
           <w:p>
             <w:pPr>
-              <w:spacing w:before="60" w:after="60"/>
+              <w:spacing w:after="0"/>
             </w:pPr>
             <w:r>
               <w:rPr>
                 <w:b/>
+                <w:sz w:val="18"/>
               </w:rPr>
-              <w:t>Negotiation Details</w:t>
+              <w:t>Attached Files:</w:t>
+            </w:r>
+          </w:p>
+        </w:tc>
+        <w:tc>
+          <w:tcPr>
+            <w:tcW w:type="dxa" w:w="6437"/>
+            <w:tcMar>
+              <w:top w:w="35" w:type="dxa"/>
+              <w:bottom w:w="35" w:type="dxa"/>
+              <w:left w:w="60" w:type="dxa"/>
+              <w:right w:w="60" w:type="dxa"/>
+            </w:tcMar>
+          </w:tcPr>
+          <w:p>
+            <w:pPr>
+              <w:spacing w:after="0"/>
+            </w:pPr>
+            <w:r>
+              <w:rPr>
+                <w:sz w:val="17"/>
+              </w:rPr>
+              <w:t>,Annexure-I-Indent,Annexure-II-Estimate,Annexure-III-LPP,Annexure-IV-3years-Consumption,SMSO-email,Work arrangement</w:t>
             </w:r>
           </w:p>
         </w:tc>
@@ -1233,1236 +2896,57 @@
       <w:tr>
         <w:tc>
           <w:tcPr>
-            <w:tcW w:type="dxa" w:w="6624"/>
-            <w:gridSpan w:val="2"/>
+            <w:tcW w:type="dxa" w:w="3600"/>
             <w:tcMar>
-              <w:top w:w="60" w:type="dxa"/>
-              <w:bottom w:w="60" w:type="dxa"/>
+              <w:top w:w="35" w:type="dxa"/>
+              <w:bottom w:w="35" w:type="dxa"/>
               <w:left w:w="60" w:type="dxa"/>
               <w:right w:w="60" w:type="dxa"/>
             </w:tcMar>
           </w:tcPr>
-          <w:p/>
-          <w:tbl>
-            <w:tblPr>
-              <w:tblW w:type="auto" w:w="0"/>
-              <w:jc w:val="center"/>
-              <w:tblLook w:firstColumn="1" w:firstRow="1" w:lastColumn="0" w:lastRow="0" w:noHBand="0" w:noVBand="1" w:val="04A0"/>
-              <w:tblBorders>
-                <w:top w:val="single" w:sz="4" w:space="0" w:color="CBD5E1"/>
-                <w:left w:val="single" w:sz="4" w:space="0" w:color="CBD5E1"/>
-                <w:bottom w:val="single" w:sz="4" w:space="0" w:color="CBD5E1"/>
-                <w:right w:val="single" w:sz="4" w:space="0" w:color="CBD5E1"/>
-                <w:insideH w:val="single" w:sz="4" w:space="0" w:color="CBD5E1"/>
-                <w:insideV w:val="single" w:sz="4" w:space="0" w:color="CBD5E1"/>
-              </w:tblBorders>
-            </w:tblPr>
-            <w:tblGrid>
-              <w:gridCol w:w="3504"/>
-              <w:gridCol w:w="3504"/>
-              <w:gridCol w:w="3504"/>
-            </w:tblGrid>
-            <w:tr>
-              <w:tc>
-                <w:tcPr>
-                  <w:tcW w:type="dxa" w:w="3504"/>
-                  <w:shd w:fill="F1F5F9"/>
-                  <w:tcMar>
-                    <w:top w:w="120" w:type="dxa"/>
-                    <w:bottom w:w="120" w:type="dxa"/>
-                    <w:left w:w="180" w:type="dxa"/>
-                    <w:right w:w="180" w:type="dxa"/>
-                  </w:tcMar>
-                </w:tcPr>
-                <w:p>
-                  <w:r>
-                    <w:rPr>
-                      <w:b/>
-                    </w:rPr>
-                    <w:t>Parameter</w:t>
-                  </w:r>
-                </w:p>
-              </w:tc>
-              <w:tc>
-                <w:tcPr>
-                  <w:tcW w:type="dxa" w:w="3504"/>
-                  <w:shd w:fill="F1F5F9"/>
-                  <w:tcMar>
-                    <w:top w:w="120" w:type="dxa"/>
-                    <w:bottom w:w="120" w:type="dxa"/>
-                    <w:left w:w="180" w:type="dxa"/>
-                    <w:right w:w="180" w:type="dxa"/>
-                  </w:tcMar>
-                </w:tcPr>
-                <w:p>
-                  <w:r>
-                    <w:rPr>
-                      <w:b/>
-                    </w:rPr>
-                    <w:t>Tender Price</w:t>
-                  </w:r>
-                </w:p>
-              </w:tc>
-              <w:tc>
-                <w:tcPr>
-                  <w:tcW w:type="dxa" w:w="3504"/>
-                  <w:shd w:fill="F1F5F9"/>
-                  <w:tcMar>
-                    <w:top w:w="120" w:type="dxa"/>
-                    <w:bottom w:w="120" w:type="dxa"/>
-                    <w:left w:w="180" w:type="dxa"/>
-                    <w:right w:w="180" w:type="dxa"/>
-                  </w:tcMar>
-                </w:tcPr>
-                <w:p>
-                  <w:r>
-                    <w:rPr>
-                      <w:b/>
-                    </w:rPr>
-                    <w:t>After Negotiation</w:t>
-                  </w:r>
-                </w:p>
-              </w:tc>
-            </w:tr>
-            <w:tr>
-              <w:tc>
-                <w:tcPr>
-                  <w:tcW w:type="dxa" w:w="3504"/>
-                  <w:tcMar>
-                    <w:top w:w="120" w:type="dxa"/>
-                    <w:bottom w:w="120" w:type="dxa"/>
-                    <w:left w:w="180" w:type="dxa"/>
-                    <w:right w:w="180" w:type="dxa"/>
-                  </w:tcMar>
-                </w:tcPr>
-                <w:p>
-                  <w:r>
-                    <w:rPr>
-                      <w:b/>
-                    </w:rPr>
-                    <w:t>Price Offered</w:t>
-                  </w:r>
-                </w:p>
-              </w:tc>
-              <w:tc>
-                <w:tcPr>
-                  <w:tcW w:type="dxa" w:w="3504"/>
-                  <w:tcMar>
-                    <w:top w:w="120" w:type="dxa"/>
-                    <w:bottom w:w="120" w:type="dxa"/>
-                    <w:left w:w="180" w:type="dxa"/>
-                    <w:right w:w="180" w:type="dxa"/>
-                  </w:tcMar>
-                </w:tcPr>
-                <w:p>
-                  <w:r>
-                    <w:t>₹ 42,669/- per MT</w:t>
-                  </w:r>
-                </w:p>
-              </w:tc>
-              <w:tc>
-                <w:tcPr>
-                  <w:tcW w:type="dxa" w:w="3504"/>
-                  <w:tcMar>
-                    <w:top w:w="120" w:type="dxa"/>
-                    <w:bottom w:w="120" w:type="dxa"/>
-                    <w:left w:w="180" w:type="dxa"/>
-                    <w:right w:w="180" w:type="dxa"/>
-                  </w:tcMar>
-                </w:tcPr>
-                <w:p>
-                  <w:r>
-                    <w:t>₹ 42,669/- per MT</w:t>
-                  </w:r>
-                </w:p>
-              </w:tc>
-            </w:tr>
-            <w:tr>
-              <w:tc>
-                <w:tcPr>
-                  <w:tcW w:type="dxa" w:w="3504"/>
-                  <w:tcMar>
-                    <w:top w:w="120" w:type="dxa"/>
-                    <w:bottom w:w="120" w:type="dxa"/>
-                    <w:left w:w="180" w:type="dxa"/>
-                    <w:right w:w="180" w:type="dxa"/>
-                  </w:tcMar>
-                </w:tcPr>
-                <w:p>
-                  <w:r>
-                    <w:rPr>
-                      <w:b/>
-                    </w:rPr>
-                    <w:t>Deviation in Value w.r.t Estimate</w:t>
-                  </w:r>
-                </w:p>
-              </w:tc>
-              <w:tc>
-                <w:tcPr>
-                  <w:tcW w:type="dxa" w:w="3504"/>
-                  <w:tcMar>
-                    <w:top w:w="120" w:type="dxa"/>
-                    <w:bottom w:w="120" w:type="dxa"/>
-                    <w:left w:w="180" w:type="dxa"/>
-                    <w:right w:w="180" w:type="dxa"/>
-                  </w:tcMar>
-                </w:tcPr>
-                <w:p>
-                  <w:r>
-                    <w:t>₹ 0.00</w:t>
-                  </w:r>
-                </w:p>
-              </w:tc>
-              <w:tc>
-                <w:tcPr>
-                  <w:tcW w:type="dxa" w:w="3504"/>
-                  <w:tcMar>
-                    <w:top w:w="120" w:type="dxa"/>
-                    <w:bottom w:w="120" w:type="dxa"/>
-                    <w:left w:w="180" w:type="dxa"/>
-                    <w:right w:w="180" w:type="dxa"/>
-                  </w:tcMar>
-                </w:tcPr>
-                <w:p>
-                  <w:r>
-                    <w:t>₹ 0.00</w:t>
-                  </w:r>
-                </w:p>
-              </w:tc>
-            </w:tr>
-            <w:tr>
-              <w:tc>
-                <w:tcPr>
-                  <w:tcW w:type="dxa" w:w="3504"/>
-                  <w:tcMar>
-                    <w:top w:w="120" w:type="dxa"/>
-                    <w:bottom w:w="120" w:type="dxa"/>
-                    <w:left w:w="180" w:type="dxa"/>
-                    <w:right w:w="180" w:type="dxa"/>
-                  </w:tcMar>
-                </w:tcPr>
-                <w:p>
-                  <w:r>
-                    <w:rPr>
-                      <w:b/>
-                    </w:rPr>
-                    <w:t>Deviation in % w.r.t Estimate</w:t>
-                  </w:r>
-                </w:p>
-              </w:tc>
-              <w:tc>
-                <w:tcPr>
-                  <w:tcW w:type="dxa" w:w="3504"/>
-                  <w:tcMar>
-                    <w:top w:w="120" w:type="dxa"/>
-                    <w:bottom w:w="120" w:type="dxa"/>
-                    <w:left w:w="180" w:type="dxa"/>
-                    <w:right w:w="180" w:type="dxa"/>
-                  </w:tcMar>
-                </w:tcPr>
-                <w:p>
-                  <w:r>
-                    <w:t>0.00%</w:t>
-                  </w:r>
-                </w:p>
-              </w:tc>
-              <w:tc>
-                <w:tcPr>
-                  <w:tcW w:type="dxa" w:w="3504"/>
-                  <w:tcMar>
-                    <w:top w:w="120" w:type="dxa"/>
-                    <w:bottom w:w="120" w:type="dxa"/>
-                    <w:left w:w="180" w:type="dxa"/>
-                    <w:right w:w="180" w:type="dxa"/>
-                  </w:tcMar>
-                </w:tcPr>
-                <w:p>
-                  <w:r>
-                    <w:t>0.00%</w:t>
-                  </w:r>
-                </w:p>
-              </w:tc>
-            </w:tr>
-            <w:tr>
-              <w:tc>
-                <w:tcPr>
-                  <w:tcW w:type="dxa" w:w="3504"/>
-                  <w:tcMar>
-                    <w:top w:w="120" w:type="dxa"/>
-                    <w:bottom w:w="120" w:type="dxa"/>
-                    <w:left w:w="180" w:type="dxa"/>
-                    <w:right w:w="180" w:type="dxa"/>
-                  </w:tcMar>
-                </w:tcPr>
-                <w:p>
-                  <w:r>
-                    <w:rPr>
-                      <w:b/>
-                    </w:rPr>
-                    <w:t>Approving Authority</w:t>
-                  </w:r>
-                </w:p>
-              </w:tc>
-              <w:tc>
-                <w:tcPr>
-                  <w:tcW w:type="dxa" w:w="3504"/>
-                  <w:tcMar>
-                    <w:top w:w="120" w:type="dxa"/>
-                    <w:bottom w:w="120" w:type="dxa"/>
-                    <w:left w:w="180" w:type="dxa"/>
-                    <w:right w:w="180" w:type="dxa"/>
-                  </w:tcMar>
-                </w:tcPr>
-                <w:p>
-                  <w:r>
-                    <w:t>EXECUTIVE DIRECTOR</w:t>
-                  </w:r>
-                </w:p>
-              </w:tc>
-              <w:tc>
-                <w:tcPr>
-                  <w:tcW w:type="dxa" w:w="3504"/>
-                  <w:tcMar>
-                    <w:top w:w="120" w:type="dxa"/>
-                    <w:bottom w:w="120" w:type="dxa"/>
-                    <w:left w:w="180" w:type="dxa"/>
-                    <w:right w:w="180" w:type="dxa"/>
-                  </w:tcMar>
-                </w:tcPr>
-                <w:p>
-                  <w:r>
-                    <w:t>EXECUTIVE DIRECTOR</w:t>
-                  </w:r>
-                </w:p>
-              </w:tc>
-            </w:tr>
-          </w:tbl>
-          <w:p/>
-        </w:tc>
-      </w:tr>
-    </w:tbl>
-    <w:p>
-      <w:pPr>
-        <w:spacing w:after="160"/>
-      </w:pPr>
-    </w:p>
-    <w:p>
-      <w:pPr>
-        <w:spacing w:before="120" w:after="80"/>
-      </w:pPr>
-      <w:r>
-        <w:rPr>
-          <w:b/>
-          <w:color w:val="0F172A"/>
-          <w:sz w:val="22"/>
-        </w:rPr>
-        <w:t>Narrative Clauses 1–9</w:t>
-      </w:r>
-    </w:p>
-    <w:p>
-      <w:pPr>
-        <w:spacing w:after="80" w:line="276" w:lineRule="auto"/>
-      </w:pPr>
-      <w:r>
-        <w:t>1. The indent is raised for procurement of MS SCRAP - SHREDDED against Indent No. SMS/25/002 / PR No. SMS/23/075 dated 11/04/2025 for Steel Melting Shop operation requirement.</w:t>
-      </w:r>
-    </w:p>
-    <w:p>
-      <w:pPr>
-        <w:spacing w:after="80" w:line="276" w:lineRule="auto"/>
-      </w:pPr>
-      <w:r>
-        <w:t>2. The estimate of ₹ 1,32,27,32,800/- is based on the last purchase price vide AT ref. A412032/F1,F2,F3 dated 24.03.25 placed on M/s KSJ Recyclers Private Limited, Chennai, M/s Shabro Metallic Pvt. Ltd., Chennai and M/s MTC Business Pvt. Ltd., Mumbai, respectively at the landed rate of Rs. 42,668.80 per MT.</w:t>
-      </w:r>
-    </w:p>
-    <w:p>
-      <w:pPr>
-        <w:spacing w:after="80" w:line="276" w:lineRule="auto"/>
-      </w:pPr>
-      <w:r>
-        <w:t>3. Empanelled suppliers offers through EPS Reverse Auction (LPP benchmarked from 3 parties: M/s KSJ Recyclers, M/s Shabro Metallic, M/s MTC Business) have been considered for establishing reasonable price benchmark.</w:t>
-      </w:r>
-    </w:p>
-    <w:p>
-      <w:pPr>
-        <w:spacing w:after="80" w:line="276" w:lineRule="auto"/>
-      </w:pPr>
-      <w:r>
-        <w:t>4. Procurement through OTE THROUGH EPS (M-JUNCTION) is recommended in accordance with SAIL Purchase Manual and approved Delegation of Powers.</w:t>
-      </w:r>
-    </w:p>
-    <w:p>
-      <w:pPr>
-        <w:spacing w:after="80" w:line="276" w:lineRule="auto"/>
-      </w:pPr>
-      <w:r>
-        <w:t>5. Technical specifications conform to standard requirement for MS SCRAP - SHREDDED (Material Code: 135070000300) as vetted by indenting department.</w:t>
-      </w:r>
-    </w:p>
-    <w:p>
-      <w:pPr>
-        <w:spacing w:after="80" w:line="276" w:lineRule="auto"/>
-      </w:pPr>
-      <w:r>
-        <w:t>6. The qualifying criteria requires established suppliers capable of supplying 31,000 MT of MS-Shredded scrap meeting bulk requirements.</w:t>
-      </w:r>
-    </w:p>
-    <w:p>
-      <w:pPr>
-        <w:spacing w:after="80" w:line="276" w:lineRule="auto"/>
-      </w:pPr>
-      <w:r>
-        <w:t>7. Techno-commercial evaluation confirms full compliance to tender terms and specifications without commercial deviations.</w:t>
-      </w:r>
-    </w:p>
-    <w:p>
-      <w:pPr>
-        <w:spacing w:after="80" w:line="276" w:lineRule="auto"/>
-      </w:pPr>
-      <w:r>
-        <w:t>8. Being volatile scrap items, order distribution shall be made among maximum three parties to ensure uninterrupted supply.</w:t>
-      </w:r>
-    </w:p>
-    <w:p>
-      <w:pPr>
-        <w:spacing w:after="80" w:line="276" w:lineRule="auto"/>
-      </w:pPr>
-      <w:r>
-        <w:t>9. In view of the above, it is proposed to place order for procurement of MS SCRAP - SHREDDED on empanelled suppliers through EPS (M-junction) Reverse Auction, as per the following terms &amp; conditions:</w:t>
-      </w:r>
-    </w:p>
-    <w:p>
-      <w:pPr>
-        <w:spacing w:after="120"/>
-      </w:pPr>
-    </w:p>
-    <w:tbl>
-      <w:tblPr>
-        <w:tblW w:type="auto" w:w="0"/>
-        <w:jc w:val="center"/>
-        <w:tblLook w:firstColumn="1" w:firstRow="1" w:lastColumn="0" w:lastRow="0" w:noHBand="0" w:noVBand="1" w:val="04A0"/>
-        <w:tblBorders>
-          <w:top w:val="single" w:sz="4" w:space="0" w:color="CCCCCC"/>
-          <w:left w:val="single" w:sz="4" w:space="0" w:color="CCCCCC"/>
-          <w:bottom w:val="single" w:sz="4" w:space="0" w:color="CCCCCC"/>
-          <w:right w:val="single" w:sz="4" w:space="0" w:color="CCCCCC"/>
-          <w:insideH w:val="single" w:sz="4" w:space="0" w:color="CCCCCC"/>
-          <w:insideV w:val="single" w:sz="4" w:space="0" w:color="CCCCCC"/>
-        </w:tblBorders>
-      </w:tblPr>
-      <w:tblGrid>
-        <w:gridCol w:w="5256"/>
-        <w:gridCol w:w="5256"/>
-      </w:tblGrid>
-      <w:tr>
-        <w:tc>
-          <w:tcPr>
-            <w:tcW w:type="dxa" w:w="6624"/>
-            <w:gridSpan w:val="2"/>
-            <w:shd w:fill="E2E8F0"/>
-            <w:tcMar>
-              <w:top w:w="120" w:type="dxa"/>
-              <w:bottom w:w="120" w:type="dxa"/>
-              <w:left w:w="180" w:type="dxa"/>
-              <w:right w:w="180" w:type="dxa"/>
-            </w:tcMar>
-          </w:tcPr>
           <w:p>
             <w:pPr>
-              <w:spacing w:before="60" w:after="60"/>
+              <w:spacing w:after="0"/>
             </w:pPr>
             <w:r>
               <w:rPr>
                 <w:b/>
+                <w:sz w:val="18"/>
               </w:rPr>
-              <w:t>Proposed Order Terms</w:t>
-            </w:r>
-          </w:p>
-        </w:tc>
-      </w:tr>
-      <w:tr>
-        <w:tc>
-          <w:tcPr>
-            <w:tcW w:type="dxa" w:w="3744"/>
-            <w:tcMar>
-              <w:top w:w="120" w:type="dxa"/>
-              <w:bottom w:w="120" w:type="dxa"/>
-              <w:left w:w="180" w:type="dxa"/>
-              <w:right w:w="180" w:type="dxa"/>
-            </w:tcMar>
-            <w:shd w:fill="EDF2F7"/>
-          </w:tcPr>
-          <w:p>
-            <w:pPr>
-              <w:spacing w:before="40" w:after="40"/>
-            </w:pPr>
-            <w:r>
-              <w:rPr>
-                <w:b/>
-              </w:rPr>
-              <w:t>Parameter</w:t>
+              <w:t>Proposal Status</w:t>
+              <w:br/>
+              <w:t>(SSP/SLM/MM PURCHASE/GEN/2025/214)</w:t>
             </w:r>
           </w:p>
         </w:tc>
         <w:tc>
           <w:tcPr>
-            <w:tcW w:type="dxa" w:w="6624"/>
+            <w:tcW w:type="dxa" w:w="6437"/>
             <w:tcMar>
-              <w:top w:w="120" w:type="dxa"/>
-              <w:bottom w:w="120" w:type="dxa"/>
-              <w:left w:w="180" w:type="dxa"/>
-              <w:right w:w="180" w:type="dxa"/>
+              <w:top w:w="35" w:type="dxa"/>
+              <w:bottom w:w="35" w:type="dxa"/>
+              <w:left w:w="60" w:type="dxa"/>
+              <w:right w:w="60" w:type="dxa"/>
             </w:tcMar>
-            <w:shd w:fill="EDF2F7"/>
           </w:tcPr>
           <w:p>
             <w:pPr>
-              <w:spacing w:before="40" w:after="40"/>
+              <w:spacing w:after="0"/>
             </w:pPr>
             <w:r>
               <w:rPr>
                 <w:b/>
+                <w:sz w:val="19"/>
               </w:rPr>
-              <w:t>Value</w:t>
-            </w:r>
-          </w:p>
-        </w:tc>
-      </w:tr>
-      <w:tr>
-        <w:tc>
-          <w:tcPr>
-            <w:tcW w:type="dxa" w:w="3744"/>
-            <w:tcMar>
-              <w:top w:w="120" w:type="dxa"/>
-              <w:bottom w:w="120" w:type="dxa"/>
-              <w:left w:w="180" w:type="dxa"/>
-              <w:right w:w="180" w:type="dxa"/>
-            </w:tcMar>
-          </w:tcPr>
-          <w:p>
-            <w:pPr>
-              <w:spacing w:before="40" w:after="40"/>
-            </w:pPr>
-            <w:r>
-              <w:rPr>
-                <w:b/>
-              </w:rPr>
-              <w:t>Supplier Name</w:t>
-            </w:r>
-          </w:p>
-        </w:tc>
-        <w:tc>
-          <w:tcPr>
-            <w:tcW w:type="dxa" w:w="6624"/>
-            <w:tcMar>
-              <w:top w:w="120" w:type="dxa"/>
-              <w:bottom w:w="120" w:type="dxa"/>
-              <w:left w:w="180" w:type="dxa"/>
-              <w:right w:w="180" w:type="dxa"/>
-            </w:tcMar>
-          </w:tcPr>
-          <w:p>
-            <w:pPr>
-              <w:spacing w:before="40" w:after="40"/>
-            </w:pPr>
-            <w:r>
-              <w:t>Maximum three parties as per tender terms (through EPS price discovery)</w:t>
-            </w:r>
-          </w:p>
-        </w:tc>
-      </w:tr>
-      <w:tr>
-        <w:tc>
-          <w:tcPr>
-            <w:tcW w:type="dxa" w:w="3744"/>
-            <w:tcMar>
-              <w:top w:w="120" w:type="dxa"/>
-              <w:bottom w:w="120" w:type="dxa"/>
-              <w:left w:w="180" w:type="dxa"/>
-              <w:right w:w="180" w:type="dxa"/>
-            </w:tcMar>
-          </w:tcPr>
-          <w:p>
-            <w:pPr>
-              <w:spacing w:before="40" w:after="40"/>
-            </w:pPr>
-            <w:r>
-              <w:rPr>
-                <w:b/>
-              </w:rPr>
-              <w:t>Item Description</w:t>
-            </w:r>
-          </w:p>
-        </w:tc>
-        <w:tc>
-          <w:tcPr>
-            <w:tcW w:type="dxa" w:w="6624"/>
-            <w:tcMar>
-              <w:top w:w="120" w:type="dxa"/>
-              <w:bottom w:w="120" w:type="dxa"/>
-              <w:left w:w="180" w:type="dxa"/>
-              <w:right w:w="180" w:type="dxa"/>
-            </w:tcMar>
-          </w:tcPr>
-          <w:p>
-            <w:pPr>
-              <w:spacing w:before="40" w:after="40"/>
-            </w:pPr>
-            <w:r>
-              <w:t>MS SCRAP - SHREDDED (Code: 135070000300)</w:t>
-            </w:r>
-          </w:p>
-        </w:tc>
-      </w:tr>
-      <w:tr>
-        <w:tc>
-          <w:tcPr>
-            <w:tcW w:type="dxa" w:w="3744"/>
-            <w:tcMar>
-              <w:top w:w="120" w:type="dxa"/>
-              <w:bottom w:w="120" w:type="dxa"/>
-              <w:left w:w="180" w:type="dxa"/>
-              <w:right w:w="180" w:type="dxa"/>
-            </w:tcMar>
-          </w:tcPr>
-          <w:p>
-            <w:pPr>
-              <w:spacing w:before="40" w:after="40"/>
-            </w:pPr>
-            <w:r>
-              <w:rPr>
-                <w:b/>
-              </w:rPr>
-              <w:t>Total Order Value without GST</w:t>
-            </w:r>
-          </w:p>
-        </w:tc>
-        <w:tc>
-          <w:tcPr>
-            <w:tcW w:type="dxa" w:w="6624"/>
-            <w:tcMar>
-              <w:top w:w="120" w:type="dxa"/>
-              <w:bottom w:w="120" w:type="dxa"/>
-              <w:left w:w="180" w:type="dxa"/>
-              <w:right w:w="180" w:type="dxa"/>
-            </w:tcMar>
-          </w:tcPr>
-          <w:p>
-            <w:pPr>
-              <w:spacing w:before="40" w:after="40"/>
-            </w:pPr>
-            <w:r>
-              <w:t>₹ 1,12,09,60,000/-</w:t>
-            </w:r>
-          </w:p>
-        </w:tc>
-      </w:tr>
-      <w:tr>
-        <w:tc>
-          <w:tcPr>
-            <w:tcW w:type="dxa" w:w="3744"/>
-            <w:tcMar>
-              <w:top w:w="120" w:type="dxa"/>
-              <w:bottom w:w="120" w:type="dxa"/>
-              <w:left w:w="180" w:type="dxa"/>
-              <w:right w:w="180" w:type="dxa"/>
-            </w:tcMar>
-          </w:tcPr>
-          <w:p>
-            <w:pPr>
-              <w:spacing w:before="40" w:after="40"/>
-            </w:pPr>
-            <w:r>
-              <w:rPr>
-                <w:b/>
-              </w:rPr>
-              <w:t>Total Order Value with GST</w:t>
-            </w:r>
-          </w:p>
-        </w:tc>
-        <w:tc>
-          <w:tcPr>
-            <w:tcW w:type="dxa" w:w="6624"/>
-            <w:tcMar>
-              <w:top w:w="120" w:type="dxa"/>
-              <w:bottom w:w="120" w:type="dxa"/>
-              <w:left w:w="180" w:type="dxa"/>
-              <w:right w:w="180" w:type="dxa"/>
-            </w:tcMar>
-          </w:tcPr>
-          <w:p>
-            <w:pPr>
-              <w:spacing w:before="40" w:after="40"/>
-            </w:pPr>
-            <w:r>
-              <w:t>₹ 1,32,27,32,800/-</w:t>
-            </w:r>
-          </w:p>
-        </w:tc>
-      </w:tr>
-      <w:tr>
-        <w:tc>
-          <w:tcPr>
-            <w:tcW w:type="dxa" w:w="3744"/>
-            <w:tcMar>
-              <w:top w:w="120" w:type="dxa"/>
-              <w:bottom w:w="120" w:type="dxa"/>
-              <w:left w:w="180" w:type="dxa"/>
-              <w:right w:w="180" w:type="dxa"/>
-            </w:tcMar>
-          </w:tcPr>
-          <w:p>
-            <w:pPr>
-              <w:spacing w:before="40" w:after="40"/>
-            </w:pPr>
-            <w:r>
-              <w:rPr>
-                <w:b/>
-              </w:rPr>
-              <w:t>Estimate</w:t>
-            </w:r>
-          </w:p>
-        </w:tc>
-        <w:tc>
-          <w:tcPr>
-            <w:tcW w:type="dxa" w:w="6624"/>
-            <w:tcMar>
-              <w:top w:w="120" w:type="dxa"/>
-              <w:bottom w:w="120" w:type="dxa"/>
-              <w:left w:w="180" w:type="dxa"/>
-              <w:right w:w="180" w:type="dxa"/>
-            </w:tcMar>
-          </w:tcPr>
-          <w:p>
-            <w:pPr>
-              <w:spacing w:before="40" w:after="40"/>
-            </w:pPr>
-            <w:r>
-              <w:t>₹ 1,32,27,32,800/-</w:t>
-            </w:r>
-          </w:p>
-        </w:tc>
-      </w:tr>
-      <w:tr>
-        <w:tc>
-          <w:tcPr>
-            <w:tcW w:type="dxa" w:w="3744"/>
-            <w:tcMar>
-              <w:top w:w="120" w:type="dxa"/>
-              <w:bottom w:w="120" w:type="dxa"/>
-              <w:left w:w="180" w:type="dxa"/>
-              <w:right w:w="180" w:type="dxa"/>
-            </w:tcMar>
-          </w:tcPr>
-          <w:p>
-            <w:pPr>
-              <w:spacing w:before="40" w:after="40"/>
-            </w:pPr>
-            <w:r>
-              <w:rPr>
-                <w:b/>
-              </w:rPr>
-              <w:t>% Dev wrt estimate</w:t>
-            </w:r>
-          </w:p>
-        </w:tc>
-        <w:tc>
-          <w:tcPr>
-            <w:tcW w:type="dxa" w:w="6624"/>
-            <w:tcMar>
-              <w:top w:w="120" w:type="dxa"/>
-              <w:bottom w:w="120" w:type="dxa"/>
-              <w:left w:w="180" w:type="dxa"/>
-              <w:right w:w="180" w:type="dxa"/>
-            </w:tcMar>
-          </w:tcPr>
-          <w:p>
-            <w:pPr>
-              <w:spacing w:before="40" w:after="40"/>
-            </w:pPr>
-            <w:r>
-              <w:t>0.00% (At par with estimate)</w:t>
-            </w:r>
-          </w:p>
-        </w:tc>
-      </w:tr>
-      <w:tr>
-        <w:tc>
-          <w:tcPr>
-            <w:tcW w:type="dxa" w:w="6624"/>
-            <w:gridSpan w:val="2"/>
-            <w:shd w:fill="E2E8F0"/>
-            <w:tcMar>
-              <w:top w:w="120" w:type="dxa"/>
-              <w:bottom w:w="120" w:type="dxa"/>
-              <w:left w:w="180" w:type="dxa"/>
-              <w:right w:w="180" w:type="dxa"/>
-            </w:tcMar>
-          </w:tcPr>
-          <w:p>
-            <w:pPr>
-              <w:spacing w:before="60" w:after="60"/>
-            </w:pPr>
-            <w:r>
-              <w:rPr>
-                <w:b/>
-              </w:rPr>
-              <w:t>Commercial Terms</w:t>
-            </w:r>
-          </w:p>
-        </w:tc>
-      </w:tr>
-      <w:tr>
-        <w:tc>
-          <w:tcPr>
-            <w:tcW w:type="dxa" w:w="3744"/>
-            <w:tcMar>
-              <w:top w:w="120" w:type="dxa"/>
-              <w:bottom w:w="120" w:type="dxa"/>
-              <w:left w:w="180" w:type="dxa"/>
-              <w:right w:w="180" w:type="dxa"/>
-            </w:tcMar>
-            <w:shd w:fill="EDF2F7"/>
-          </w:tcPr>
-          <w:p>
-            <w:pPr>
-              <w:spacing w:before="40" w:after="40"/>
-            </w:pPr>
-            <w:r>
-              <w:rPr>
-                <w:b/>
-              </w:rPr>
-              <w:t>Parameter</w:t>
-            </w:r>
-          </w:p>
-        </w:tc>
-        <w:tc>
-          <w:tcPr>
-            <w:tcW w:type="dxa" w:w="6624"/>
-            <w:tcMar>
-              <w:top w:w="120" w:type="dxa"/>
-              <w:bottom w:w="120" w:type="dxa"/>
-              <w:left w:w="180" w:type="dxa"/>
-              <w:right w:w="180" w:type="dxa"/>
-            </w:tcMar>
-            <w:shd w:fill="EDF2F7"/>
-          </w:tcPr>
-          <w:p>
-            <w:pPr>
-              <w:spacing w:before="40" w:after="40"/>
-            </w:pPr>
-            <w:r>
-              <w:rPr>
-                <w:b/>
-              </w:rPr>
-              <w:t>Value</w:t>
-            </w:r>
-          </w:p>
-        </w:tc>
-      </w:tr>
-      <w:tr>
-        <w:tc>
-          <w:tcPr>
-            <w:tcW w:type="dxa" w:w="3744"/>
-            <w:tcMar>
-              <w:top w:w="120" w:type="dxa"/>
-              <w:bottom w:w="120" w:type="dxa"/>
-              <w:left w:w="180" w:type="dxa"/>
-              <w:right w:w="180" w:type="dxa"/>
-            </w:tcMar>
-          </w:tcPr>
-          <w:p>
-            <w:pPr>
-              <w:spacing w:before="40" w:after="40"/>
-            </w:pPr>
-            <w:r>
-              <w:rPr>
-                <w:b/>
-              </w:rPr>
-              <w:t>Terms of Delivery</w:t>
-            </w:r>
-          </w:p>
-        </w:tc>
-        <w:tc>
-          <w:tcPr>
-            <w:tcW w:type="dxa" w:w="6624"/>
-            <w:tcMar>
-              <w:top w:w="120" w:type="dxa"/>
-              <w:bottom w:w="120" w:type="dxa"/>
-              <w:left w:w="180" w:type="dxa"/>
-              <w:right w:w="180" w:type="dxa"/>
-            </w:tcMar>
-          </w:tcPr>
-          <w:p>
-            <w:pPr>
-              <w:spacing w:before="40" w:after="40"/>
-            </w:pPr>
-            <w:r>
-              <w:t>F.O.R. Salem Steel Plant</w:t>
-            </w:r>
-          </w:p>
-        </w:tc>
-      </w:tr>
-      <w:tr>
-        <w:tc>
-          <w:tcPr>
-            <w:tcW w:type="dxa" w:w="3744"/>
-            <w:tcMar>
-              <w:top w:w="120" w:type="dxa"/>
-              <w:bottom w:w="120" w:type="dxa"/>
-              <w:left w:w="180" w:type="dxa"/>
-              <w:right w:w="180" w:type="dxa"/>
-            </w:tcMar>
-          </w:tcPr>
-          <w:p>
-            <w:pPr>
-              <w:spacing w:before="40" w:after="40"/>
-            </w:pPr>
-            <w:r>
-              <w:rPr>
-                <w:b/>
-              </w:rPr>
-              <w:t>Delivery Schedule</w:t>
-            </w:r>
-          </w:p>
-        </w:tc>
-        <w:tc>
-          <w:tcPr>
-            <w:tcW w:type="dxa" w:w="6624"/>
-            <w:tcMar>
-              <w:top w:w="120" w:type="dxa"/>
-              <w:bottom w:w="120" w:type="dxa"/>
-              <w:left w:w="180" w:type="dxa"/>
-              <w:right w:w="180" w:type="dxa"/>
-            </w:tcMar>
-          </w:tcPr>
-          <w:p>
-            <w:pPr>
-              <w:spacing w:before="40" w:after="40"/>
-            </w:pPr>
-            <w:r>
-              <w:t>Supply shall start within 10 days from date of order and shall be completed within 30 days from the date of order in a phased manner.</w:t>
-            </w:r>
-          </w:p>
-        </w:tc>
-      </w:tr>
-      <w:tr>
-        <w:tc>
-          <w:tcPr>
-            <w:tcW w:type="dxa" w:w="3744"/>
-            <w:tcMar>
-              <w:top w:w="120" w:type="dxa"/>
-              <w:bottom w:w="120" w:type="dxa"/>
-              <w:left w:w="180" w:type="dxa"/>
-              <w:right w:w="180" w:type="dxa"/>
-            </w:tcMar>
-          </w:tcPr>
-          <w:p>
-            <w:pPr>
-              <w:spacing w:before="40" w:after="40"/>
-            </w:pPr>
-            <w:r>
-              <w:rPr>
-                <w:b/>
-              </w:rPr>
-              <w:t>Payment Terms</w:t>
-            </w:r>
-          </w:p>
-        </w:tc>
-        <w:tc>
-          <w:tcPr>
-            <w:tcW w:type="dxa" w:w="6624"/>
-            <w:tcMar>
-              <w:top w:w="120" w:type="dxa"/>
-              <w:bottom w:w="120" w:type="dxa"/>
-              <w:left w:w="180" w:type="dxa"/>
-              <w:right w:w="180" w:type="dxa"/>
-            </w:tcMar>
-          </w:tcPr>
-          <w:p>
-            <w:pPr>
-              <w:spacing w:before="40" w:after="40"/>
-            </w:pPr>
-            <w:r>
-              <w:t>Payment within 15 days upon acceptance supported by GARN/SRV.</w:t>
-            </w:r>
-          </w:p>
-        </w:tc>
-      </w:tr>
-      <w:tr>
-        <w:tc>
-          <w:tcPr>
-            <w:tcW w:type="dxa" w:w="3744"/>
-            <w:tcMar>
-              <w:top w:w="120" w:type="dxa"/>
-              <w:bottom w:w="120" w:type="dxa"/>
-              <w:left w:w="180" w:type="dxa"/>
-              <w:right w:w="180" w:type="dxa"/>
-            </w:tcMar>
-          </w:tcPr>
-          <w:p>
-            <w:pPr>
-              <w:spacing w:before="40" w:after="40"/>
-            </w:pPr>
-            <w:r>
-              <w:rPr>
-                <w:b/>
-              </w:rPr>
-              <w:t>Offer Validity</w:t>
-            </w:r>
-          </w:p>
-        </w:tc>
-        <w:tc>
-          <w:tcPr>
-            <w:tcW w:type="dxa" w:w="6624"/>
-            <w:tcMar>
-              <w:top w:w="120" w:type="dxa"/>
-              <w:bottom w:w="120" w:type="dxa"/>
-              <w:left w:w="180" w:type="dxa"/>
-              <w:right w:w="180" w:type="dxa"/>
-            </w:tcMar>
-          </w:tcPr>
-          <w:p>
-            <w:pPr>
-              <w:spacing w:before="40" w:after="40"/>
-            </w:pPr>
-            <w:r>
-              <w:t>One year from the date of empanelment (with extension for pending indent quantity)</w:t>
-            </w:r>
-          </w:p>
-        </w:tc>
-      </w:tr>
-    </w:tbl>
-    <w:p>
-      <w:pPr>
-        <w:spacing w:after="160"/>
-      </w:pPr>
-    </w:p>
-    <w:tbl>
-      <w:tblPr>
-        <w:tblW w:type="auto" w:w="0"/>
-        <w:jc w:val="center"/>
-        <w:tblLook w:firstColumn="1" w:firstRow="1" w:lastColumn="0" w:lastRow="0" w:noHBand="0" w:noVBand="1" w:val="04A0"/>
-        <w:tblBorders>
-          <w:top w:val="single" w:sz="4" w:space="0" w:color="CCCCCC"/>
-          <w:left w:val="single" w:sz="4" w:space="0" w:color="CCCCCC"/>
-          <w:bottom w:val="single" w:sz="4" w:space="0" w:color="CCCCCC"/>
-          <w:right w:val="single" w:sz="4" w:space="0" w:color="CCCCCC"/>
-          <w:insideH w:val="single" w:sz="4" w:space="0" w:color="CCCCCC"/>
-          <w:insideV w:val="single" w:sz="4" w:space="0" w:color="CCCCCC"/>
-        </w:tblBorders>
-      </w:tblPr>
-      <w:tblGrid>
-        <w:gridCol w:w="5256"/>
-        <w:gridCol w:w="5256"/>
-      </w:tblGrid>
-      <w:tr>
-        <w:tc>
-          <w:tcPr>
-            <w:tcW w:type="dxa" w:w="6624"/>
-            <w:gridSpan w:val="2"/>
-            <w:shd w:fill="E2E8F0"/>
-            <w:tcMar>
-              <w:top w:w="120" w:type="dxa"/>
-              <w:bottom w:w="120" w:type="dxa"/>
-              <w:left w:w="180" w:type="dxa"/>
-              <w:right w:w="180" w:type="dxa"/>
-            </w:tcMar>
-          </w:tcPr>
-          <w:p>
-            <w:pPr>
-              <w:spacing w:before="60" w:after="60"/>
-            </w:pPr>
-            <w:r>
-              <w:rPr>
-                <w:b/>
-              </w:rPr>
-              <w:t>Approval Section</w:t>
-            </w:r>
-          </w:p>
-        </w:tc>
-      </w:tr>
-      <w:tr>
-        <w:tc>
-          <w:tcPr>
-            <w:tcW w:type="dxa" w:w="3744"/>
-            <w:tcMar>
-              <w:top w:w="120" w:type="dxa"/>
-              <w:bottom w:w="120" w:type="dxa"/>
-              <w:left w:w="180" w:type="dxa"/>
-              <w:right w:w="180" w:type="dxa"/>
-            </w:tcMar>
-            <w:shd w:fill="EDF2F7"/>
-          </w:tcPr>
-          <w:p>
-            <w:pPr>
-              <w:spacing w:before="40" w:after="40"/>
-            </w:pPr>
-            <w:r>
-              <w:rPr>
-                <w:b/>
-              </w:rPr>
-              <w:t>Parameter</w:t>
-            </w:r>
-          </w:p>
-        </w:tc>
-        <w:tc>
-          <w:tcPr>
-            <w:tcW w:type="dxa" w:w="6624"/>
-            <w:tcMar>
-              <w:top w:w="120" w:type="dxa"/>
-              <w:bottom w:w="120" w:type="dxa"/>
-              <w:left w:w="180" w:type="dxa"/>
-              <w:right w:w="180" w:type="dxa"/>
-            </w:tcMar>
-            <w:shd w:fill="EDF2F7"/>
-          </w:tcPr>
-          <w:p>
-            <w:pPr>
-              <w:spacing w:before="40" w:after="40"/>
-            </w:pPr>
-            <w:r>
-              <w:rPr>
-                <w:b/>
-              </w:rPr>
-              <w:t>Value</w:t>
-            </w:r>
-          </w:p>
-        </w:tc>
-      </w:tr>
-      <w:tr>
-        <w:tc>
-          <w:tcPr>
-            <w:tcW w:type="dxa" w:w="3744"/>
-            <w:tcMar>
-              <w:top w:w="120" w:type="dxa"/>
-              <w:bottom w:w="120" w:type="dxa"/>
-              <w:left w:w="180" w:type="dxa"/>
-              <w:right w:w="180" w:type="dxa"/>
-            </w:tcMar>
-          </w:tcPr>
-          <w:p>
-            <w:pPr>
-              <w:spacing w:before="40" w:after="40"/>
-            </w:pPr>
-            <w:r>
-              <w:rPr>
-                <w:b/>
-              </w:rPr>
-              <w:t>Approval Sought For</w:t>
-            </w:r>
-          </w:p>
-        </w:tc>
-        <w:tc>
-          <w:tcPr>
-            <w:tcW w:type="dxa" w:w="6624"/>
-            <w:tcMar>
-              <w:top w:w="120" w:type="dxa"/>
-              <w:bottom w:w="120" w:type="dxa"/>
-              <w:left w:w="180" w:type="dxa"/>
-              <w:right w:w="180" w:type="dxa"/>
-            </w:tcMar>
-          </w:tcPr>
-          <w:p>
-            <w:pPr>
-              <w:spacing w:before="40" w:after="40"/>
-            </w:pPr>
-            <w:r>
-              <w:t>The above recommendations of Task Force committee for Scrap procurement of SMS for FY 2025-26 may be approved.</w:t>
-            </w:r>
-          </w:p>
-        </w:tc>
-      </w:tr>
-      <w:tr>
-        <w:tc>
-          <w:tcPr>
-            <w:tcW w:type="dxa" w:w="3744"/>
-            <w:tcMar>
-              <w:top w:w="120" w:type="dxa"/>
-              <w:bottom w:w="120" w:type="dxa"/>
-              <w:left w:w="180" w:type="dxa"/>
-              <w:right w:w="180" w:type="dxa"/>
-            </w:tcMar>
-          </w:tcPr>
-          <w:p>
-            <w:pPr>
-              <w:spacing w:before="40" w:after="40"/>
-            </w:pPr>
-            <w:r>
-              <w:rPr>
-                <w:b/>
-              </w:rPr>
-              <w:t>Approving Authority / DOP / Manual Ref</w:t>
-            </w:r>
-          </w:p>
-        </w:tc>
-        <w:tc>
-          <w:tcPr>
-            <w:tcW w:type="dxa" w:w="6624"/>
-            <w:tcMar>
-              <w:top w:w="120" w:type="dxa"/>
-              <w:bottom w:w="120" w:type="dxa"/>
-              <w:left w:w="180" w:type="dxa"/>
-              <w:right w:w="180" w:type="dxa"/>
-            </w:tcMar>
-          </w:tcPr>
-          <w:p>
-            <w:pPr>
-              <w:spacing w:before="40" w:after="40"/>
-            </w:pPr>
-            <w:r>
-              <w:t>SSP/SLM/SMSO/GEN/2024/208</w:t>
-            </w:r>
-          </w:p>
-        </w:tc>
-      </w:tr>
-      <w:tr>
-        <w:tc>
-          <w:tcPr>
-            <w:tcW w:type="dxa" w:w="3744"/>
-            <w:tcMar>
-              <w:top w:w="120" w:type="dxa"/>
-              <w:bottom w:w="120" w:type="dxa"/>
-              <w:left w:w="180" w:type="dxa"/>
-              <w:right w:w="180" w:type="dxa"/>
-            </w:tcMar>
-          </w:tcPr>
-          <w:p>
-            <w:pPr>
-              <w:spacing w:before="40" w:after="40"/>
-            </w:pPr>
-            <w:r>
-              <w:rPr>
-                <w:b/>
-              </w:rPr>
-              <w:t>Suggested Approval Path</w:t>
-            </w:r>
-          </w:p>
-        </w:tc>
-        <w:tc>
-          <w:tcPr>
-            <w:tcW w:type="dxa" w:w="6624"/>
-            <w:tcMar>
-              <w:top w:w="120" w:type="dxa"/>
-              <w:bottom w:w="120" w:type="dxa"/>
-              <w:left w:w="180" w:type="dxa"/>
-              <w:right w:w="180" w:type="dxa"/>
-            </w:tcMar>
-          </w:tcPr>
-          <w:p>
-            <w:pPr>
-              <w:spacing w:before="40" w:after="40"/>
-            </w:pPr>
-            <w:r>
-              <w:t>GM(SMS)/ GM I/c(MM)/ CGM(Maintenance, Steel&amp;Projects)/ CGM I/c(W)/ CGM(F&amp;A)/ ED</w:t>
+              <w:t>Approved</w:t>
             </w:r>
           </w:p>
         </w:tc>
       </w:tr>
     </w:tbl>
     <w:sectPr>
-      <w:pgSz w:w="12240" w:h="15840"/>
-      <w:pgMar w:top="864" w:right="864" w:bottom="864" w:left="864" w:header="720" w:footer="720" w:gutter="0"/>
+      <w:pgSz w:w="11909" w:h="16834"/>
+      <w:pgMar w:top="864" w:right="936" w:bottom="864" w:left="936" w:header="720" w:footer="720" w:gutter="0"/>
       <w:cols w:space="720"/>
       <w:docGrid w:linePitch="360"/>
     </w:sectPr>
@@ -2833,10 +3317,13 @@
     <w:name w:val="Normal"/>
     <w:qFormat/>
     <w:rsid w:val="00FC693F"/>
+    <w:pPr>
+      <w:spacing w:line="276" w:lineRule="auto" w:after="60"/>
+    </w:pPr>
     <w:rPr>
-      <w:rFonts w:ascii="Calibri" w:hAnsi="Calibri"/>
-      <w:color w:val="1E293B"/>
-      <w:sz w:val="20"/>
+      <w:rFonts w:ascii="Arial" w:hAnsi="Arial"/>
+      <w:color w:val="000000"/>
+      <w:sz w:val="19"/>
     </w:rPr>
   </w:style>
   <w:style w:type="paragraph" w:styleId="Header">

</xml_diff>